<commit_message>
feat(syllabus): reestructurar a 16 clases con nuevo orden
- 16 sesiones semanales (era 15)
- Clases 01-02: Modelado de Canal (2 sesiones)
- Clases 04-05: OFDM teoría I y II; clase 06: Lab GNU Radio
- Clase 08: Examen Parcial; clase 09: MIMO+MIMO Masivo combinados
- Clases 12-14: Seminarios papers (IA, SDR, IoT)
- Clase 15: 6G; clase 16: Examen Final
- Arcos temáticos actualizados en md y docx

Co-Authored-By: Claude Sonnet 4.6 <noreply@anthropic.com>
</commit_message>
<xml_diff>
--- a/syllabus-EEE10.docx
+++ b/syllabus-EEE10.docx
@@ -80,7 +80,7 @@
         <w:rPr>
           <w:sz w:val="20"/>
         </w:rPr>
-        <w:t xml:space="preserve">Autónoma, acceso abierto · 15 sesiones · </w:t>
+        <w:t xml:space="preserve">Autónoma, acceso abierto · 16 sesiones · </w:t>
       </w:r>
       <w:r>
         <w:rPr>
@@ -167,7 +167,7 @@
           <w:sz w:val="20"/>
           <w:szCs w:val="20"/>
         </w:rPr>
-        <w:t>Fundamentos de Capa Física (Sesiones 1–5): canal inalámbrico, modulación digital, OFDM, codificación de canal, acceso múltiple.</w:t>
+        <w:t>Fundamentos de Capa Física (Clases 1–7): canal inalámbrico, modulación digital, OFDM, laboratorio GNU Radio, codificación de canal.</w:t>
       </w:r>
     </w:p>
     <w:p>
@@ -186,7 +186,7 @@
           <w:sz w:val="20"/>
           <w:szCs w:val="20"/>
         </w:rPr>
-        <w:t>Sistemas Multi-Antena (Sesiones 6–8): MIMO, MIMO masivo, estimación de canal.</w:t>
+        <w:t>Sistemas Multi-Antena y 5G (Clases 9–11): MIMO y MIMO masivo, arquitectura 5G NR, comunicaciones mmWave.</w:t>
       </w:r>
     </w:p>
     <w:p>
@@ -205,7 +205,7 @@
           <w:sz w:val="20"/>
           <w:szCs w:val="20"/>
         </w:rPr>
-        <w:t>Tecnologías Avanzadas y Emergentes (Sesiones 9–15): 5G NR, mmWave, RIS, ISAC, radio cognitiva, IA/ML aplicado, fronteras del 6G.</w:t>
+        <w:t>Seminarios y Tendencias (Clases 12–16): IA en comunicaciones, Software-Defined Radio, Wireless IoT, 6G, examen final.</w:t>
       </w:r>
     </w:p>
     <w:p>
@@ -963,7 +963,7 @@
             <w:pPr>
               <w:pStyle w:val="Normal"/>
               <w:widowControl/>
-              <w:spacing w:lineRule="auto" w:line="240" w:before="0" w:after="20"/>
+              <w:spacing w:lineRule="auto" w:line="240" w:before="0" w:after="0"/>
               <w:jc w:val="left"/>
               <w:rPr>
                 <w:rFonts w:ascii="Cambria" w:hAnsi="Cambria" w:eastAsia="ＭＳ 明朝" w:cs=""/>
@@ -975,6 +975,7 @@
             <w:r>
               <w:rPr>
                 <w:rFonts w:eastAsia="ＭＳ 明朝" w:cs=""/>
+                <w:b/>
                 <w:kern w:val="0"/>
                 <w:sz w:val="18"/>
                 <w:szCs w:val="22"/>
@@ -993,7 +994,7 @@
             <w:pPr>
               <w:pStyle w:val="Normal"/>
               <w:widowControl/>
-              <w:spacing w:lineRule="auto" w:line="240" w:before="0" w:after="20"/>
+              <w:spacing w:lineRule="auto" w:line="240" w:before="0" w:after="0"/>
               <w:jc w:val="left"/>
               <w:rPr>
                 <w:rFonts w:ascii="Cambria" w:hAnsi="Cambria" w:eastAsia="ＭＳ 明朝" w:cs=""/>
@@ -1005,6 +1006,7 @@
             <w:r>
               <w:rPr>
                 <w:rFonts w:eastAsia="ＭＳ 明朝" w:cs=""/>
+                <w:b/>
                 <w:kern w:val="0"/>
                 <w:sz w:val="18"/>
                 <w:szCs w:val="22"/>
@@ -1023,7 +1025,7 @@
             <w:pPr>
               <w:pStyle w:val="Normal"/>
               <w:widowControl/>
-              <w:spacing w:lineRule="auto" w:line="240" w:before="0" w:after="20"/>
+              <w:spacing w:lineRule="auto" w:line="240" w:before="0" w:after="0"/>
               <w:jc w:val="left"/>
               <w:rPr>
                 <w:rFonts w:ascii="Cambria" w:hAnsi="Cambria" w:eastAsia="ＭＳ 明朝" w:cs=""/>
@@ -1035,6 +1037,7 @@
             <w:r>
               <w:rPr>
                 <w:rFonts w:eastAsia="ＭＳ 明朝" w:cs=""/>
+                <w:b/>
                 <w:kern w:val="0"/>
                 <w:sz w:val="18"/>
                 <w:szCs w:val="22"/>
@@ -1053,7 +1056,7 @@
             <w:pPr>
               <w:pStyle w:val="Normal"/>
               <w:widowControl/>
-              <w:spacing w:lineRule="auto" w:line="240" w:before="0" w:after="20"/>
+              <w:spacing w:lineRule="auto" w:line="240" w:before="0" w:after="0"/>
               <w:jc w:val="left"/>
               <w:rPr>
                 <w:rFonts w:ascii="Cambria" w:hAnsi="Cambria" w:eastAsia="ＭＳ 明朝" w:cs=""/>
@@ -1065,6 +1068,7 @@
             <w:r>
               <w:rPr>
                 <w:rFonts w:eastAsia="ＭＳ 明朝" w:cs=""/>
+                <w:b/>
                 <w:kern w:val="0"/>
                 <w:sz w:val="18"/>
                 <w:szCs w:val="22"/>
@@ -1086,7 +1090,7 @@
             <w:pPr>
               <w:pStyle w:val="Normal"/>
               <w:widowControl/>
-              <w:spacing w:lineRule="auto" w:line="240" w:before="0" w:after="20"/>
+              <w:spacing w:lineRule="auto" w:line="240" w:before="0" w:after="0"/>
               <w:jc w:val="left"/>
               <w:rPr>
                 <w:rFonts w:ascii="Cambria" w:hAnsi="Cambria" w:eastAsia="ＭＳ 明朝" w:cs=""/>
@@ -1098,6 +1102,7 @@
             <w:r>
               <w:rPr>
                 <w:rFonts w:eastAsia="ＭＳ 明朝" w:cs=""/>
+                <w:b/>
                 <w:kern w:val="0"/>
                 <w:sz w:val="18"/>
                 <w:szCs w:val="22"/>
@@ -1116,7 +1121,7 @@
             <w:pPr>
               <w:pStyle w:val="Normal"/>
               <w:widowControl/>
-              <w:spacing w:lineRule="auto" w:line="240" w:before="0" w:after="20"/>
+              <w:spacing w:lineRule="auto" w:line="240" w:before="0" w:after="0"/>
               <w:jc w:val="left"/>
               <w:rPr>
                 <w:rFonts w:ascii="Cambria" w:hAnsi="Cambria" w:eastAsia="ＭＳ 明朝" w:cs=""/>
@@ -1128,6 +1133,134 @@
             <w:r>
               <w:rPr>
                 <w:rFonts w:eastAsia="ＭＳ 明朝" w:cs=""/>
+                <w:b/>
+                <w:kern w:val="0"/>
+                <w:sz w:val="18"/>
+                <w:szCs w:val="22"/>
+                <w:lang w:val="en-US" w:eastAsia="en-US" w:bidi="ar-SA"/>
+              </w:rPr>
+              <w:t>Modelado del Canal Inalámbrico</w:t>
+            </w:r>
+          </w:p>
+        </w:tc>
+        <w:tc>
+          <w:tcPr>
+            <w:tcW w:w="3467" w:type="dxa"/>
+            <w:tcBorders/>
+          </w:tcPr>
+          <w:p>
+            <w:pPr>
+              <w:pStyle w:val="Normal"/>
+              <w:widowControl/>
+              <w:spacing w:lineRule="auto" w:line="240" w:before="0" w:after="0"/>
+              <w:jc w:val="left"/>
+              <w:rPr>
+                <w:rFonts w:ascii="Cambria" w:hAnsi="Cambria" w:eastAsia="ＭＳ 明朝" w:cs=""/>
+                <w:kern w:val="0"/>
+                <w:szCs w:val="22"/>
+                <w:lang w:val="en-US" w:eastAsia="en-US" w:bidi="ar-SA"/>
+              </w:rPr>
+            </w:pPr>
+            <w:r>
+              <w:rPr>
+                <w:rFonts w:eastAsia="ＭＳ 明朝" w:cs=""/>
+                <w:b/>
+                <w:kern w:val="0"/>
+                <w:sz w:val="18"/>
+                <w:szCs w:val="22"/>
+                <w:lang w:val="en-US" w:eastAsia="en-US" w:bidi="ar-SA"/>
+              </w:rPr>
+              <w:t>Canal multipath, perfil de potencia de retardo (PDP), ancho de banda de coherencia, tiempo de coherencia, espectro Doppler, caracterización estadística</w:t>
+            </w:r>
+          </w:p>
+        </w:tc>
+        <w:tc>
+          <w:tcPr>
+            <w:tcW w:w="3300" w:type="dxa"/>
+            <w:tcBorders/>
+          </w:tcPr>
+          <w:p>
+            <w:pPr>
+              <w:pStyle w:val="Normal"/>
+              <w:widowControl/>
+              <w:spacing w:lineRule="auto" w:line="240" w:before="0" w:after="0"/>
+              <w:jc w:val="left"/>
+              <w:rPr>
+                <w:rFonts w:ascii="Cambria" w:hAnsi="Cambria" w:eastAsia="ＭＳ 明朝" w:cs=""/>
+                <w:kern w:val="0"/>
+                <w:szCs w:val="22"/>
+                <w:lang w:val="en-US" w:eastAsia="en-US" w:bidi="ar-SA"/>
+              </w:rPr>
+            </w:pPr>
+            <w:r>
+              <w:rPr>
+                <w:rFonts w:eastAsia="ＭＳ 明朝" w:cs=""/>
+                <w:b/>
+                <w:kern w:val="0"/>
+                <w:sz w:val="18"/>
+                <w:szCs w:val="22"/>
+                <w:lang w:val="en-US" w:eastAsia="en-US" w:bidi="ar-SA"/>
+              </w:rPr>
+              <w:t>—</w:t>
+            </w:r>
+          </w:p>
+        </w:tc>
+      </w:tr>
+      <w:tr>
+        <w:trPr/>
+        <w:tc>
+          <w:tcPr>
+            <w:tcW w:w="617" w:type="dxa"/>
+            <w:tcBorders/>
+          </w:tcPr>
+          <w:p>
+            <w:pPr>
+              <w:pStyle w:val="Normal"/>
+              <w:widowControl/>
+              <w:spacing w:lineRule="auto" w:line="240" w:before="0" w:after="0"/>
+              <w:jc w:val="left"/>
+              <w:rPr>
+                <w:rFonts w:ascii="Cambria" w:hAnsi="Cambria" w:eastAsia="ＭＳ 明朝" w:cs=""/>
+                <w:kern w:val="0"/>
+                <w:szCs w:val="22"/>
+                <w:lang w:val="en-US" w:eastAsia="en-US" w:bidi="ar-SA"/>
+              </w:rPr>
+            </w:pPr>
+            <w:r>
+              <w:rPr>
+                <w:rFonts w:eastAsia="ＭＳ 明朝" w:cs=""/>
+                <w:b/>
+                <w:kern w:val="0"/>
+                <w:sz w:val="18"/>
+                <w:szCs w:val="22"/>
+                <w:lang w:val="en-US" w:eastAsia="en-US" w:bidi="ar-SA"/>
+              </w:rPr>
+              <w:t>03</w:t>
+            </w:r>
+          </w:p>
+        </w:tc>
+        <w:tc>
+          <w:tcPr>
+            <w:tcW w:w="1983" w:type="dxa"/>
+            <w:tcBorders/>
+          </w:tcPr>
+          <w:p>
+            <w:pPr>
+              <w:pStyle w:val="Normal"/>
+              <w:widowControl/>
+              <w:spacing w:lineRule="auto" w:line="240" w:before="0" w:after="0"/>
+              <w:jc w:val="left"/>
+              <w:rPr>
+                <w:rFonts w:ascii="Cambria" w:hAnsi="Cambria" w:eastAsia="ＭＳ 明朝" w:cs=""/>
+                <w:kern w:val="0"/>
+                <w:szCs w:val="22"/>
+                <w:lang w:val="en-US" w:eastAsia="en-US" w:bidi="ar-SA"/>
+              </w:rPr>
+            </w:pPr>
+            <w:r>
+              <w:rPr>
+                <w:rFonts w:eastAsia="ＭＳ 明朝" w:cs=""/>
+                <w:b/>
                 <w:kern w:val="0"/>
                 <w:sz w:val="18"/>
                 <w:szCs w:val="22"/>
@@ -1146,7 +1279,7 @@
             <w:pPr>
               <w:pStyle w:val="Normal"/>
               <w:widowControl/>
-              <w:spacing w:lineRule="auto" w:line="240" w:before="0" w:after="20"/>
+              <w:spacing w:lineRule="auto" w:line="240" w:before="0" w:after="0"/>
               <w:jc w:val="left"/>
               <w:rPr>
                 <w:rFonts w:ascii="Cambria" w:hAnsi="Cambria" w:eastAsia="ＭＳ 明朝" w:cs=""/>
@@ -1158,6 +1291,7 @@
             <w:r>
               <w:rPr>
                 <w:rFonts w:eastAsia="ＭＳ 明朝" w:cs=""/>
+                <w:b/>
                 <w:kern w:val="0"/>
                 <w:sz w:val="18"/>
                 <w:szCs w:val="22"/>
@@ -1176,7 +1310,7 @@
             <w:pPr>
               <w:pStyle w:val="Normal"/>
               <w:widowControl/>
-              <w:spacing w:lineRule="auto" w:line="240" w:before="0" w:after="20"/>
+              <w:spacing w:lineRule="auto" w:line="240" w:before="0" w:after="0"/>
               <w:jc w:val="left"/>
               <w:rPr>
                 <w:rFonts w:ascii="Cambria" w:hAnsi="Cambria" w:eastAsia="ＭＳ 明朝" w:cs=""/>
@@ -1188,6 +1322,7 @@
             <w:r>
               <w:rPr>
                 <w:rFonts w:eastAsia="ＭＳ 明朝" w:cs=""/>
+                <w:b/>
                 <w:kern w:val="0"/>
                 <w:sz w:val="18"/>
                 <w:szCs w:val="22"/>
@@ -1209,7 +1344,7 @@
             <w:pPr>
               <w:pStyle w:val="Normal"/>
               <w:widowControl/>
-              <w:spacing w:lineRule="auto" w:line="240" w:before="0" w:after="20"/>
+              <w:spacing w:lineRule="auto" w:line="240" w:before="0" w:after="0"/>
               <w:jc w:val="left"/>
               <w:rPr>
                 <w:rFonts w:ascii="Cambria" w:hAnsi="Cambria" w:eastAsia="ＭＳ 明朝" w:cs=""/>
@@ -1221,129 +1356,7 @@
             <w:r>
               <w:rPr>
                 <w:rFonts w:eastAsia="ＭＳ 明朝" w:cs=""/>
-                <w:kern w:val="0"/>
-                <w:sz w:val="18"/>
-                <w:szCs w:val="22"/>
-                <w:lang w:val="en-US" w:eastAsia="en-US" w:bidi="ar-SA"/>
-              </w:rPr>
-              <w:t>03</w:t>
-            </w:r>
-          </w:p>
-        </w:tc>
-        <w:tc>
-          <w:tcPr>
-            <w:tcW w:w="1983" w:type="dxa"/>
-            <w:tcBorders/>
-          </w:tcPr>
-          <w:p>
-            <w:pPr>
-              <w:pStyle w:val="Normal"/>
-              <w:widowControl/>
-              <w:spacing w:lineRule="auto" w:line="240" w:before="0" w:after="20"/>
-              <w:jc w:val="left"/>
-              <w:rPr>
-                <w:rFonts w:ascii="Cambria" w:hAnsi="Cambria" w:eastAsia="ＭＳ 明朝" w:cs=""/>
-                <w:kern w:val="0"/>
-                <w:szCs w:val="22"/>
-                <w:lang w:val="en-US" w:eastAsia="en-US" w:bidi="ar-SA"/>
-              </w:rPr>
-            </w:pPr>
-            <w:r>
-              <w:rPr>
-                <w:rFonts w:eastAsia="ＭＳ 明朝" w:cs=""/>
-                <w:kern w:val="0"/>
-                <w:sz w:val="18"/>
-                <w:szCs w:val="22"/>
-                <w:lang w:val="en-US" w:eastAsia="en-US" w:bidi="ar-SA"/>
-              </w:rPr>
-              <w:t>Sistemas OFDM e Implementación</w:t>
-            </w:r>
-          </w:p>
-        </w:tc>
-        <w:tc>
-          <w:tcPr>
-            <w:tcW w:w="3467" w:type="dxa"/>
-            <w:tcBorders/>
-          </w:tcPr>
-          <w:p>
-            <w:pPr>
-              <w:pStyle w:val="Normal"/>
-              <w:widowControl/>
-              <w:spacing w:lineRule="auto" w:line="240" w:before="0" w:after="20"/>
-              <w:jc w:val="left"/>
-              <w:rPr>
-                <w:rFonts w:ascii="Cambria" w:hAnsi="Cambria" w:eastAsia="ＭＳ 明朝" w:cs=""/>
-                <w:kern w:val="0"/>
-                <w:szCs w:val="22"/>
-                <w:lang w:val="en-US" w:eastAsia="en-US" w:bidi="ar-SA"/>
-              </w:rPr>
-            </w:pPr>
-            <w:r>
-              <w:rPr>
-                <w:rFonts w:eastAsia="ＭＳ 明朝" w:cs=""/>
-                <w:kern w:val="0"/>
-                <w:sz w:val="18"/>
-                <w:szCs w:val="22"/>
-                <w:lang w:val="en-US" w:eastAsia="en-US" w:bidi="ar-SA"/>
-              </w:rPr>
-              <w:t>Concepto multiportadora, transceptor IFFT/FFT, prefijo cíclico, ICI, eficiencia espectral, PAPR</w:t>
-            </w:r>
-          </w:p>
-        </w:tc>
-        <w:tc>
-          <w:tcPr>
-            <w:tcW w:w="3300" w:type="dxa"/>
-            <w:tcBorders/>
-          </w:tcPr>
-          <w:p>
-            <w:pPr>
-              <w:pStyle w:val="Normal"/>
-              <w:widowControl/>
-              <w:spacing w:lineRule="auto" w:line="240" w:before="0" w:after="20"/>
-              <w:jc w:val="left"/>
-              <w:rPr>
-                <w:rFonts w:ascii="Cambria" w:hAnsi="Cambria" w:eastAsia="ＭＳ 明朝" w:cs=""/>
-                <w:kern w:val="0"/>
-                <w:szCs w:val="22"/>
-                <w:lang w:val="en-US" w:eastAsia="en-US" w:bidi="ar-SA"/>
-              </w:rPr>
-            </w:pPr>
-            <w:r>
-              <w:rPr>
-                <w:rFonts w:eastAsia="ＭＳ 明朝" w:cs=""/>
-                <w:kern w:val="0"/>
-                <w:sz w:val="18"/>
-                <w:szCs w:val="22"/>
-                <w:lang w:val="en-US" w:eastAsia="en-US" w:bidi="ar-SA"/>
-              </w:rPr>
-              <w:t>Transceptor OFDM completo; simulación sobre canal con desvanecimiento selectivo en frecuencia</w:t>
-            </w:r>
-          </w:p>
-        </w:tc>
-      </w:tr>
-      <w:tr>
-        <w:trPr/>
-        <w:tc>
-          <w:tcPr>
-            <w:tcW w:w="617" w:type="dxa"/>
-            <w:tcBorders/>
-          </w:tcPr>
-          <w:p>
-            <w:pPr>
-              <w:pStyle w:val="Normal"/>
-              <w:widowControl/>
-              <w:spacing w:lineRule="auto" w:line="240" w:before="0" w:after="20"/>
-              <w:jc w:val="left"/>
-              <w:rPr>
-                <w:rFonts w:ascii="Cambria" w:hAnsi="Cambria" w:eastAsia="ＭＳ 明朝" w:cs=""/>
-                <w:kern w:val="0"/>
-                <w:szCs w:val="22"/>
-                <w:lang w:val="en-US" w:eastAsia="en-US" w:bidi="ar-SA"/>
-              </w:rPr>
-            </w:pPr>
-            <w:r>
-              <w:rPr>
-                <w:rFonts w:eastAsia="ＭＳ 明朝" w:cs=""/>
+                <w:b/>
                 <w:kern w:val="0"/>
                 <w:sz w:val="18"/>
                 <w:szCs w:val="22"/>
@@ -1362,7 +1375,7 @@
             <w:pPr>
               <w:pStyle w:val="Normal"/>
               <w:widowControl/>
-              <w:spacing w:lineRule="auto" w:line="240" w:before="0" w:after="20"/>
+              <w:spacing w:lineRule="auto" w:line="240" w:before="0" w:after="0"/>
               <w:jc w:val="left"/>
               <w:rPr>
                 <w:rFonts w:ascii="Cambria" w:hAnsi="Cambria" w:eastAsia="ＭＳ 明朝" w:cs=""/>
@@ -1374,6 +1387,388 @@
             <w:r>
               <w:rPr>
                 <w:rFonts w:eastAsia="ＭＳ 明朝" w:cs=""/>
+                <w:b/>
+                <w:kern w:val="0"/>
+                <w:sz w:val="18"/>
+                <w:szCs w:val="22"/>
+                <w:lang w:val="en-US" w:eastAsia="en-US" w:bidi="ar-SA"/>
+              </w:rPr>
+              <w:t>Sistemas OFDM e Implementación (I)</w:t>
+            </w:r>
+          </w:p>
+        </w:tc>
+        <w:tc>
+          <w:tcPr>
+            <w:tcW w:w="3467" w:type="dxa"/>
+            <w:tcBorders/>
+          </w:tcPr>
+          <w:p>
+            <w:pPr>
+              <w:pStyle w:val="Normal"/>
+              <w:widowControl/>
+              <w:spacing w:lineRule="auto" w:line="240" w:before="0" w:after="0"/>
+              <w:jc w:val="left"/>
+              <w:rPr>
+                <w:rFonts w:ascii="Cambria" w:hAnsi="Cambria" w:eastAsia="ＭＳ 明朝" w:cs=""/>
+                <w:kern w:val="0"/>
+                <w:szCs w:val="22"/>
+                <w:lang w:val="en-US" w:eastAsia="en-US" w:bidi="ar-SA"/>
+              </w:rPr>
+            </w:pPr>
+            <w:r>
+              <w:rPr>
+                <w:rFonts w:eastAsia="ＭＳ 明朝" w:cs=""/>
+                <w:b/>
+                <w:kern w:val="0"/>
+                <w:sz w:val="18"/>
+                <w:szCs w:val="22"/>
+                <w:lang w:val="en-US" w:eastAsia="en-US" w:bidi="ar-SA"/>
+              </w:rPr>
+              <w:t>Concepto multiportadora, transceptor IFFT/FFT, prefijo cíclico, ISI e ICI, eficiencia espectral, PAPR</w:t>
+            </w:r>
+          </w:p>
+        </w:tc>
+        <w:tc>
+          <w:tcPr>
+            <w:tcW w:w="3300" w:type="dxa"/>
+            <w:tcBorders/>
+          </w:tcPr>
+          <w:p>
+            <w:pPr>
+              <w:pStyle w:val="Normal"/>
+              <w:widowControl/>
+              <w:spacing w:lineRule="auto" w:line="240" w:before="0" w:after="0"/>
+              <w:jc w:val="left"/>
+              <w:rPr>
+                <w:rFonts w:ascii="Cambria" w:hAnsi="Cambria" w:eastAsia="ＭＳ 明朝" w:cs=""/>
+                <w:kern w:val="0"/>
+                <w:szCs w:val="22"/>
+                <w:lang w:val="en-US" w:eastAsia="en-US" w:bidi="ar-SA"/>
+              </w:rPr>
+            </w:pPr>
+            <w:r>
+              <w:rPr>
+                <w:rFonts w:eastAsia="ＭＳ 明朝" w:cs=""/>
+                <w:b/>
+                <w:kern w:val="0"/>
+                <w:sz w:val="18"/>
+                <w:szCs w:val="22"/>
+                <w:lang w:val="en-US" w:eastAsia="en-US" w:bidi="ar-SA"/>
+              </w:rPr>
+              <w:t>—</w:t>
+            </w:r>
+          </w:p>
+        </w:tc>
+      </w:tr>
+      <w:tr>
+        <w:trPr/>
+        <w:tc>
+          <w:tcPr>
+            <w:tcW w:w="617" w:type="dxa"/>
+            <w:tcBorders/>
+          </w:tcPr>
+          <w:p>
+            <w:pPr>
+              <w:pStyle w:val="Normal"/>
+              <w:widowControl/>
+              <w:spacing w:lineRule="auto" w:line="240" w:before="0" w:after="0"/>
+              <w:jc w:val="left"/>
+              <w:rPr>
+                <w:rFonts w:ascii="Cambria" w:hAnsi="Cambria" w:eastAsia="ＭＳ 明朝" w:cs=""/>
+                <w:kern w:val="0"/>
+                <w:szCs w:val="22"/>
+                <w:lang w:val="en-US" w:eastAsia="en-US" w:bidi="ar-SA"/>
+              </w:rPr>
+            </w:pPr>
+            <w:r>
+              <w:rPr>
+                <w:rFonts w:eastAsia="ＭＳ 明朝" w:cs=""/>
+                <w:b/>
+                <w:kern w:val="0"/>
+                <w:sz w:val="18"/>
+                <w:szCs w:val="22"/>
+                <w:lang w:val="en-US" w:eastAsia="en-US" w:bidi="ar-SA"/>
+              </w:rPr>
+              <w:t>05</w:t>
+            </w:r>
+          </w:p>
+        </w:tc>
+        <w:tc>
+          <w:tcPr>
+            <w:tcW w:w="1983" w:type="dxa"/>
+            <w:tcBorders/>
+          </w:tcPr>
+          <w:p>
+            <w:pPr>
+              <w:pStyle w:val="Normal"/>
+              <w:widowControl/>
+              <w:spacing w:lineRule="auto" w:line="240" w:before="0" w:after="0"/>
+              <w:jc w:val="left"/>
+              <w:rPr>
+                <w:rFonts w:ascii="Cambria" w:hAnsi="Cambria" w:eastAsia="ＭＳ 明朝" w:cs=""/>
+                <w:kern w:val="0"/>
+                <w:szCs w:val="22"/>
+                <w:lang w:val="en-US" w:eastAsia="en-US" w:bidi="ar-SA"/>
+              </w:rPr>
+            </w:pPr>
+            <w:r>
+              <w:rPr>
+                <w:rFonts w:eastAsia="ＭＳ 明朝" w:cs=""/>
+                <w:b/>
+                <w:kern w:val="0"/>
+                <w:sz w:val="18"/>
+                <w:szCs w:val="22"/>
+                <w:lang w:val="en-US" w:eastAsia="en-US" w:bidi="ar-SA"/>
+              </w:rPr>
+              <w:t>Sistemas OFDM e Implementación (II)</w:t>
+            </w:r>
+          </w:p>
+        </w:tc>
+        <w:tc>
+          <w:tcPr>
+            <w:tcW w:w="3467" w:type="dxa"/>
+            <w:tcBorders/>
+          </w:tcPr>
+          <w:p>
+            <w:pPr>
+              <w:pStyle w:val="Normal"/>
+              <w:widowControl/>
+              <w:spacing w:lineRule="auto" w:line="240" w:before="0" w:after="0"/>
+              <w:jc w:val="left"/>
+              <w:rPr>
+                <w:rFonts w:ascii="Cambria" w:hAnsi="Cambria" w:eastAsia="ＭＳ 明朝" w:cs=""/>
+                <w:kern w:val="0"/>
+                <w:szCs w:val="22"/>
+                <w:lang w:val="en-US" w:eastAsia="en-US" w:bidi="ar-SA"/>
+              </w:rPr>
+            </w:pPr>
+            <w:r>
+              <w:rPr>
+                <w:rFonts w:eastAsia="ＭＳ 明朝" w:cs=""/>
+                <w:b/>
+                <w:kern w:val="0"/>
+                <w:sz w:val="18"/>
+                <w:szCs w:val="22"/>
+                <w:lang w:val="en-US" w:eastAsia="en-US" w:bidi="ar-SA"/>
+              </w:rPr>
+              <w:t>Ecualización ZF y MMSE, estimación de canal LS con pilotos, BER de OFDM en canal selectivo en frecuencia</w:t>
+            </w:r>
+          </w:p>
+        </w:tc>
+        <w:tc>
+          <w:tcPr>
+            <w:tcW w:w="3300" w:type="dxa"/>
+            <w:tcBorders/>
+          </w:tcPr>
+          <w:p>
+            <w:pPr>
+              <w:pStyle w:val="Normal"/>
+              <w:widowControl/>
+              <w:spacing w:lineRule="auto" w:line="240" w:before="0" w:after="0"/>
+              <w:jc w:val="left"/>
+              <w:rPr>
+                <w:rFonts w:ascii="Cambria" w:hAnsi="Cambria" w:eastAsia="ＭＳ 明朝" w:cs=""/>
+                <w:kern w:val="0"/>
+                <w:szCs w:val="22"/>
+                <w:lang w:val="en-US" w:eastAsia="en-US" w:bidi="ar-SA"/>
+              </w:rPr>
+            </w:pPr>
+            <w:r>
+              <w:rPr>
+                <w:rFonts w:eastAsia="ＭＳ 明朝" w:cs=""/>
+                <w:b/>
+                <w:kern w:val="0"/>
+                <w:sz w:val="18"/>
+                <w:szCs w:val="22"/>
+                <w:lang w:val="en-US" w:eastAsia="en-US" w:bidi="ar-SA"/>
+              </w:rPr>
+              <w:t>Transceptor OFDM completo; ecualizadores ZF/MMSE; curvas BER waterfall</w:t>
+            </w:r>
+          </w:p>
+        </w:tc>
+      </w:tr>
+      <w:tr>
+        <w:trPr/>
+        <w:tc>
+          <w:tcPr>
+            <w:tcW w:w="617" w:type="dxa"/>
+            <w:tcBorders/>
+          </w:tcPr>
+          <w:p>
+            <w:pPr>
+              <w:pStyle w:val="Normal"/>
+              <w:widowControl/>
+              <w:spacing w:lineRule="auto" w:line="240" w:before="0" w:after="0"/>
+              <w:jc w:val="left"/>
+              <w:rPr>
+                <w:rFonts w:ascii="Cambria" w:hAnsi="Cambria" w:eastAsia="ＭＳ 明朝" w:cs=""/>
+                <w:kern w:val="0"/>
+                <w:szCs w:val="22"/>
+                <w:lang w:val="en-US" w:eastAsia="en-US" w:bidi="ar-SA"/>
+              </w:rPr>
+            </w:pPr>
+            <w:r>
+              <w:rPr>
+                <w:rFonts w:eastAsia="ＭＳ 明朝" w:cs=""/>
+                <w:b/>
+                <w:kern w:val="0"/>
+                <w:sz w:val="18"/>
+                <w:szCs w:val="22"/>
+                <w:lang w:val="en-US" w:eastAsia="en-US" w:bidi="ar-SA"/>
+              </w:rPr>
+              <w:t>06</w:t>
+            </w:r>
+          </w:p>
+        </w:tc>
+        <w:tc>
+          <w:tcPr>
+            <w:tcW w:w="1983" w:type="dxa"/>
+            <w:tcBorders/>
+          </w:tcPr>
+          <w:p>
+            <w:pPr>
+              <w:pStyle w:val="Normal"/>
+              <w:widowControl/>
+              <w:spacing w:lineRule="auto" w:line="240" w:before="0" w:after="0"/>
+              <w:jc w:val="left"/>
+              <w:rPr>
+                <w:rFonts w:ascii="Cambria" w:hAnsi="Cambria" w:eastAsia="ＭＳ 明朝" w:cs=""/>
+                <w:kern w:val="0"/>
+                <w:szCs w:val="22"/>
+                <w:lang w:val="en-US" w:eastAsia="en-US" w:bidi="ar-SA"/>
+              </w:rPr>
+            </w:pPr>
+            <w:r>
+              <w:rPr>
+                <w:rFonts w:eastAsia="ＭＳ 明朝" w:cs=""/>
+                <w:b/>
+                <w:kern w:val="0"/>
+                <w:sz w:val="18"/>
+                <w:szCs w:val="22"/>
+                <w:lang w:val="en-US" w:eastAsia="en-US" w:bidi="ar-SA"/>
+              </w:rPr>
+              <w:t>Lab OFDM con GNU Radio</w:t>
+            </w:r>
+          </w:p>
+        </w:tc>
+        <w:tc>
+          <w:tcPr>
+            <w:tcW w:w="3467" w:type="dxa"/>
+            <w:tcBorders/>
+          </w:tcPr>
+          <w:p>
+            <w:pPr>
+              <w:pStyle w:val="Normal"/>
+              <w:widowControl/>
+              <w:spacing w:lineRule="auto" w:line="240" w:before="0" w:after="0"/>
+              <w:jc w:val="left"/>
+              <w:rPr>
+                <w:rFonts w:ascii="Cambria" w:hAnsi="Cambria" w:eastAsia="ＭＳ 明朝" w:cs=""/>
+                <w:kern w:val="0"/>
+                <w:szCs w:val="22"/>
+                <w:lang w:val="en-US" w:eastAsia="en-US" w:bidi="ar-SA"/>
+              </w:rPr>
+            </w:pPr>
+            <w:r>
+              <w:rPr>
+                <w:rFonts w:eastAsia="ＭＳ 明朝" w:cs=""/>
+                <w:b/>
+                <w:kern w:val="0"/>
+                <w:sz w:val="18"/>
+                <w:szCs w:val="22"/>
+                <w:lang w:val="en-US" w:eastAsia="en-US" w:bidi="ar-SA"/>
+              </w:rPr>
+              <w:t>Cadena OFDM visual en GNU Radio Companion, canal AWGN y multipath, prefijo cíclico, constelación en tiempo real, medición de BER</w:t>
+            </w:r>
+          </w:p>
+        </w:tc>
+        <w:tc>
+          <w:tcPr>
+            <w:tcW w:w="3300" w:type="dxa"/>
+            <w:tcBorders/>
+          </w:tcPr>
+          <w:p>
+            <w:pPr>
+              <w:pStyle w:val="Normal"/>
+              <w:widowControl/>
+              <w:spacing w:lineRule="auto" w:line="240" w:before="0" w:after="0"/>
+              <w:jc w:val="left"/>
+              <w:rPr>
+                <w:rFonts w:ascii="Cambria" w:hAnsi="Cambria" w:eastAsia="ＭＳ 明朝" w:cs=""/>
+                <w:kern w:val="0"/>
+                <w:szCs w:val="22"/>
+                <w:lang w:val="en-US" w:eastAsia="en-US" w:bidi="ar-SA"/>
+              </w:rPr>
+            </w:pPr>
+            <w:r>
+              <w:rPr>
+                <w:rFonts w:eastAsia="ＭＳ 明朝" w:cs=""/>
+                <w:b/>
+                <w:kern w:val="0"/>
+                <w:sz w:val="18"/>
+                <w:szCs w:val="22"/>
+                <w:lang w:val="en-US" w:eastAsia="en-US" w:bidi="ar-SA"/>
+              </w:rPr>
+              <w:t>GNU Radio Companion: flujo TX/RX OFDM</w:t>
+            </w:r>
+          </w:p>
+        </w:tc>
+      </w:tr>
+      <w:tr>
+        <w:trPr/>
+        <w:tc>
+          <w:tcPr>
+            <w:tcW w:w="617" w:type="dxa"/>
+            <w:tcBorders/>
+          </w:tcPr>
+          <w:p>
+            <w:pPr>
+              <w:pStyle w:val="Normal"/>
+              <w:widowControl/>
+              <w:spacing w:lineRule="auto" w:line="240" w:before="0" w:after="0"/>
+              <w:jc w:val="left"/>
+              <w:rPr>
+                <w:rFonts w:ascii="Cambria" w:hAnsi="Cambria" w:eastAsia="ＭＳ 明朝" w:cs=""/>
+                <w:kern w:val="0"/>
+                <w:szCs w:val="22"/>
+                <w:lang w:val="en-US" w:eastAsia="en-US" w:bidi="ar-SA"/>
+              </w:rPr>
+            </w:pPr>
+            <w:r>
+              <w:rPr>
+                <w:rFonts w:eastAsia="ＭＳ 明朝" w:cs=""/>
+                <w:b/>
+                <w:kern w:val="0"/>
+                <w:sz w:val="18"/>
+                <w:szCs w:val="22"/>
+                <w:lang w:val="en-US" w:eastAsia="en-US" w:bidi="ar-SA"/>
+              </w:rPr>
+              <w:t>07</w:t>
+            </w:r>
+          </w:p>
+        </w:tc>
+        <w:tc>
+          <w:tcPr>
+            <w:tcW w:w="1983" w:type="dxa"/>
+            <w:tcBorders/>
+          </w:tcPr>
+          <w:p>
+            <w:pPr>
+              <w:pStyle w:val="Normal"/>
+              <w:widowControl/>
+              <w:spacing w:lineRule="auto" w:line="240" w:before="0" w:after="0"/>
+              <w:jc w:val="left"/>
+              <w:rPr>
+                <w:rFonts w:ascii="Cambria" w:hAnsi="Cambria" w:eastAsia="ＭＳ 明朝" w:cs=""/>
+                <w:kern w:val="0"/>
+                <w:szCs w:val="22"/>
+                <w:lang w:val="en-US" w:eastAsia="en-US" w:bidi="ar-SA"/>
+              </w:rPr>
+            </w:pPr>
+            <w:r>
+              <w:rPr>
+                <w:rFonts w:eastAsia="ＭＳ 明朝" w:cs=""/>
+                <w:b/>
                 <w:kern w:val="0"/>
                 <w:sz w:val="18"/>
                 <w:szCs w:val="22"/>
@@ -1392,7 +1787,7 @@
             <w:pPr>
               <w:pStyle w:val="Normal"/>
               <w:widowControl/>
-              <w:spacing w:lineRule="auto" w:line="240" w:before="0" w:after="20"/>
+              <w:spacing w:lineRule="auto" w:line="240" w:before="0" w:after="0"/>
               <w:jc w:val="left"/>
               <w:rPr>
                 <w:rFonts w:ascii="Cambria" w:hAnsi="Cambria" w:eastAsia="ＭＳ 明朝" w:cs=""/>
@@ -1404,12 +1799,13 @@
             <w:r>
               <w:rPr>
                 <w:rFonts w:eastAsia="ＭＳ 明朝" w:cs=""/>
+                <w:b/>
                 <w:kern w:val="0"/>
                 <w:sz w:val="18"/>
                 <w:szCs w:val="22"/>
                 <w:lang w:val="en-US" w:eastAsia="en-US" w:bidi="ar-SA"/>
               </w:rPr>
-              <w:t>Límite de Shannon, grafo de Tanner LDPC, belief propagation, códigos Polares, SCD, selección en 5G NR</w:t>
+              <w:t>Límite de Shannon, grafo de Tanner LDPC, belief propagation, códigos Polares, decodificador SC, selección en 5G NR</w:t>
             </w:r>
           </w:p>
         </w:tc>
@@ -1422,7 +1818,7 @@
             <w:pPr>
               <w:pStyle w:val="Normal"/>
               <w:widowControl/>
-              <w:spacing w:lineRule="auto" w:line="240" w:before="0" w:after="20"/>
+              <w:spacing w:lineRule="auto" w:line="240" w:before="0" w:after="0"/>
               <w:jc w:val="left"/>
               <w:rPr>
                 <w:rFonts w:ascii="Cambria" w:hAnsi="Cambria" w:eastAsia="ＭＳ 明朝" w:cs=""/>
@@ -1434,6 +1830,7 @@
             <w:r>
               <w:rPr>
                 <w:rFonts w:eastAsia="ＭＳ 明朝" w:cs=""/>
+                <w:b/>
                 <w:kern w:val="0"/>
                 <w:sz w:val="18"/>
                 <w:szCs w:val="22"/>
@@ -1455,7 +1852,7 @@
             <w:pPr>
               <w:pStyle w:val="Normal"/>
               <w:widowControl/>
-              <w:spacing w:lineRule="auto" w:line="240" w:before="0" w:after="20"/>
+              <w:spacing w:lineRule="auto" w:line="240" w:before="0" w:after="0"/>
               <w:jc w:val="left"/>
               <w:rPr>
                 <w:rFonts w:ascii="Cambria" w:hAnsi="Cambria" w:eastAsia="ＭＳ 明朝" w:cs=""/>
@@ -1467,375 +1864,7 @@
             <w:r>
               <w:rPr>
                 <w:rFonts w:eastAsia="ＭＳ 明朝" w:cs=""/>
-                <w:kern w:val="0"/>
-                <w:sz w:val="18"/>
-                <w:szCs w:val="22"/>
-                <w:lang w:val="en-US" w:eastAsia="en-US" w:bidi="ar-SA"/>
-              </w:rPr>
-              <w:t>05</w:t>
-            </w:r>
-          </w:p>
-        </w:tc>
-        <w:tc>
-          <w:tcPr>
-            <w:tcW w:w="1983" w:type="dxa"/>
-            <w:tcBorders/>
-          </w:tcPr>
-          <w:p>
-            <w:pPr>
-              <w:pStyle w:val="Normal"/>
-              <w:widowControl/>
-              <w:spacing w:lineRule="auto" w:line="240" w:before="0" w:after="20"/>
-              <w:jc w:val="left"/>
-              <w:rPr>
-                <w:rFonts w:ascii="Cambria" w:hAnsi="Cambria" w:eastAsia="ＭＳ 明朝" w:cs=""/>
-                <w:kern w:val="0"/>
-                <w:szCs w:val="22"/>
-                <w:lang w:val="en-US" w:eastAsia="en-US" w:bidi="ar-SA"/>
-              </w:rPr>
-            </w:pPr>
-            <w:r>
-              <w:rPr>
-                <w:rFonts w:eastAsia="ＭＳ 明朝" w:cs=""/>
-                <w:kern w:val="0"/>
-                <w:sz w:val="18"/>
-                <w:szCs w:val="22"/>
-                <w:lang w:val="en-US" w:eastAsia="en-US" w:bidi="ar-SA"/>
-              </w:rPr>
-              <w:t>Acceso Múltiple: OFDMA, NOMA y Gestión de Recursos</w:t>
-            </w:r>
-          </w:p>
-        </w:tc>
-        <w:tc>
-          <w:tcPr>
-            <w:tcW w:w="3467" w:type="dxa"/>
-            <w:tcBorders/>
-          </w:tcPr>
-          <w:p>
-            <w:pPr>
-              <w:pStyle w:val="Normal"/>
-              <w:widowControl/>
-              <w:spacing w:lineRule="auto" w:line="240" w:before="0" w:after="20"/>
-              <w:jc w:val="left"/>
-              <w:rPr>
-                <w:rFonts w:ascii="Cambria" w:hAnsi="Cambria" w:eastAsia="ＭＳ 明朝" w:cs=""/>
-                <w:kern w:val="0"/>
-                <w:szCs w:val="22"/>
-                <w:lang w:val="en-US" w:eastAsia="en-US" w:bidi="ar-SA"/>
-              </w:rPr>
-            </w:pPr>
-            <w:r>
-              <w:rPr>
-                <w:rFonts w:eastAsia="ＭＳ 明朝" w:cs=""/>
-                <w:kern w:val="0"/>
-                <w:sz w:val="18"/>
-                <w:szCs w:val="22"/>
-                <w:lang w:val="en-US" w:eastAsia="en-US" w:bidi="ar-SA"/>
-              </w:rPr>
-              <w:t>FDMA/TDMA/CDMA/OFDMA, asignación de subportadoras, NOMA con SIC, emparejamiento de usuarios, planificador proporcional-justo</w:t>
-            </w:r>
-          </w:p>
-        </w:tc>
-        <w:tc>
-          <w:tcPr>
-            <w:tcW w:w="3300" w:type="dxa"/>
-            <w:tcBorders/>
-          </w:tcPr>
-          <w:p>
-            <w:pPr>
-              <w:pStyle w:val="Normal"/>
-              <w:widowControl/>
-              <w:spacing w:lineRule="auto" w:line="240" w:before="0" w:after="20"/>
-              <w:jc w:val="left"/>
-              <w:rPr>
-                <w:rFonts w:ascii="Cambria" w:hAnsi="Cambria" w:eastAsia="ＭＳ 明朝" w:cs=""/>
-                <w:kern w:val="0"/>
-                <w:szCs w:val="22"/>
-                <w:lang w:val="en-US" w:eastAsia="en-US" w:bidi="ar-SA"/>
-              </w:rPr>
-            </w:pPr>
-            <w:r>
-              <w:rPr>
-                <w:rFonts w:eastAsia="ＭＳ 明朝" w:cs=""/>
-                <w:kern w:val="0"/>
-                <w:sz w:val="18"/>
-                <w:szCs w:val="22"/>
-                <w:lang w:val="en-US" w:eastAsia="en-US" w:bidi="ar-SA"/>
-              </w:rPr>
-              <w:t>Asignación OFDMA multiusuario; NOMA con SIC; comparativa NOMA vs OMA; planificador proporcional-justo</w:t>
-            </w:r>
-          </w:p>
-        </w:tc>
-      </w:tr>
-      <w:tr>
-        <w:trPr/>
-        <w:tc>
-          <w:tcPr>
-            <w:tcW w:w="617" w:type="dxa"/>
-            <w:tcBorders/>
-          </w:tcPr>
-          <w:p>
-            <w:pPr>
-              <w:pStyle w:val="Normal"/>
-              <w:widowControl/>
-              <w:spacing w:lineRule="auto" w:line="240" w:before="0" w:after="20"/>
-              <w:jc w:val="left"/>
-              <w:rPr>
-                <w:rFonts w:ascii="Cambria" w:hAnsi="Cambria" w:eastAsia="ＭＳ 明朝" w:cs=""/>
-                <w:kern w:val="0"/>
-                <w:szCs w:val="22"/>
-                <w:lang w:val="en-US" w:eastAsia="en-US" w:bidi="ar-SA"/>
-              </w:rPr>
-            </w:pPr>
-            <w:r>
-              <w:rPr>
-                <w:rFonts w:eastAsia="ＭＳ 明朝" w:cs=""/>
-                <w:kern w:val="0"/>
-                <w:sz w:val="18"/>
-                <w:szCs w:val="22"/>
-                <w:lang w:val="en-US" w:eastAsia="en-US" w:bidi="ar-SA"/>
-              </w:rPr>
-              <w:t>06</w:t>
-            </w:r>
-          </w:p>
-        </w:tc>
-        <w:tc>
-          <w:tcPr>
-            <w:tcW w:w="1983" w:type="dxa"/>
-            <w:tcBorders/>
-          </w:tcPr>
-          <w:p>
-            <w:pPr>
-              <w:pStyle w:val="Normal"/>
-              <w:widowControl/>
-              <w:spacing w:lineRule="auto" w:line="240" w:before="0" w:after="20"/>
-              <w:jc w:val="left"/>
-              <w:rPr>
-                <w:rFonts w:ascii="Cambria" w:hAnsi="Cambria" w:eastAsia="ＭＳ 明朝" w:cs=""/>
-                <w:kern w:val="0"/>
-                <w:szCs w:val="22"/>
-                <w:lang w:val="en-US" w:eastAsia="en-US" w:bidi="ar-SA"/>
-              </w:rPr>
-            </w:pPr>
-            <w:r>
-              <w:rPr>
-                <w:rFonts w:eastAsia="ＭＳ 明朝" w:cs=""/>
-                <w:kern w:val="0"/>
-                <w:sz w:val="18"/>
-                <w:szCs w:val="22"/>
-                <w:lang w:val="en-US" w:eastAsia="en-US" w:bidi="ar-SA"/>
-              </w:rPr>
-              <w:t>Fundamentos MIMO y Capacidad</w:t>
-            </w:r>
-          </w:p>
-        </w:tc>
-        <w:tc>
-          <w:tcPr>
-            <w:tcW w:w="3467" w:type="dxa"/>
-            <w:tcBorders/>
-          </w:tcPr>
-          <w:p>
-            <w:pPr>
-              <w:pStyle w:val="Normal"/>
-              <w:widowControl/>
-              <w:spacing w:lineRule="auto" w:line="240" w:before="0" w:after="20"/>
-              <w:jc w:val="left"/>
-              <w:rPr>
-                <w:rFonts w:ascii="Cambria" w:hAnsi="Cambria" w:eastAsia="ＭＳ 明朝" w:cs=""/>
-                <w:kern w:val="0"/>
-                <w:szCs w:val="22"/>
-                <w:lang w:val="en-US" w:eastAsia="en-US" w:bidi="ar-SA"/>
-              </w:rPr>
-            </w:pPr>
-            <w:r>
-              <w:rPr>
-                <w:rFonts w:eastAsia="ＭＳ 明朝" w:cs=""/>
-                <w:kern w:val="0"/>
-                <w:sz w:val="18"/>
-                <w:szCs w:val="22"/>
-                <w:lang w:val="en-US" w:eastAsia="en-US" w:bidi="ar-SA"/>
-              </w:rPr>
-              <w:t>SISO→MIMO, matriz de canal, SVD, relleno de agua, capacidad, compromiso diversidad-multiplexación, código Alamouti</w:t>
-            </w:r>
-          </w:p>
-        </w:tc>
-        <w:tc>
-          <w:tcPr>
-            <w:tcW w:w="3300" w:type="dxa"/>
-            <w:tcBorders/>
-          </w:tcPr>
-          <w:p>
-            <w:pPr>
-              <w:pStyle w:val="Normal"/>
-              <w:widowControl/>
-              <w:spacing w:lineRule="auto" w:line="240" w:before="0" w:after="20"/>
-              <w:jc w:val="left"/>
-              <w:rPr>
-                <w:rFonts w:ascii="Cambria" w:hAnsi="Cambria" w:eastAsia="ＭＳ 明朝" w:cs=""/>
-                <w:kern w:val="0"/>
-                <w:szCs w:val="22"/>
-                <w:lang w:val="en-US" w:eastAsia="en-US" w:bidi="ar-SA"/>
-              </w:rPr>
-            </w:pPr>
-            <w:r>
-              <w:rPr>
-                <w:rFonts w:eastAsia="ＭＳ 明朝" w:cs=""/>
-                <w:kern w:val="0"/>
-                <w:sz w:val="18"/>
-                <w:szCs w:val="22"/>
-                <w:lang w:val="en-US" w:eastAsia="en-US" w:bidi="ar-SA"/>
-              </w:rPr>
-              <w:t>Capacidad MIMO vía SVD; water-filling; multiplexación espacial vs diversidad Alamouti</w:t>
-            </w:r>
-          </w:p>
-        </w:tc>
-      </w:tr>
-      <w:tr>
-        <w:trPr/>
-        <w:tc>
-          <w:tcPr>
-            <w:tcW w:w="617" w:type="dxa"/>
-            <w:tcBorders/>
-          </w:tcPr>
-          <w:p>
-            <w:pPr>
-              <w:pStyle w:val="Normal"/>
-              <w:widowControl/>
-              <w:spacing w:lineRule="auto" w:line="240" w:before="0" w:after="20"/>
-              <w:jc w:val="left"/>
-              <w:rPr>
-                <w:rFonts w:ascii="Cambria" w:hAnsi="Cambria" w:eastAsia="ＭＳ 明朝" w:cs=""/>
-                <w:kern w:val="0"/>
-                <w:szCs w:val="22"/>
-                <w:lang w:val="en-US" w:eastAsia="en-US" w:bidi="ar-SA"/>
-              </w:rPr>
-            </w:pPr>
-            <w:r>
-              <w:rPr>
-                <w:rFonts w:eastAsia="ＭＳ 明朝" w:cs=""/>
-                <w:kern w:val="0"/>
-                <w:sz w:val="18"/>
-                <w:szCs w:val="22"/>
-                <w:lang w:val="en-US" w:eastAsia="en-US" w:bidi="ar-SA"/>
-              </w:rPr>
-              <w:t>07</w:t>
-            </w:r>
-          </w:p>
-        </w:tc>
-        <w:tc>
-          <w:tcPr>
-            <w:tcW w:w="1983" w:type="dxa"/>
-            <w:tcBorders/>
-          </w:tcPr>
-          <w:p>
-            <w:pPr>
-              <w:pStyle w:val="Normal"/>
-              <w:widowControl/>
-              <w:spacing w:lineRule="auto" w:line="240" w:before="0" w:after="20"/>
-              <w:jc w:val="left"/>
-              <w:rPr>
-                <w:rFonts w:ascii="Cambria" w:hAnsi="Cambria" w:eastAsia="ＭＳ 明朝" w:cs=""/>
-                <w:kern w:val="0"/>
-                <w:szCs w:val="22"/>
-                <w:lang w:val="en-US" w:eastAsia="en-US" w:bidi="ar-SA"/>
-              </w:rPr>
-            </w:pPr>
-            <w:r>
-              <w:rPr>
-                <w:rFonts w:eastAsia="ＭＳ 明朝" w:cs=""/>
-                <w:kern w:val="0"/>
-                <w:sz w:val="18"/>
-                <w:szCs w:val="22"/>
-                <w:lang w:val="en-US" w:eastAsia="en-US" w:bidi="ar-SA"/>
-              </w:rPr>
-              <w:t>MIMO Masivo y Conformación de Haz Digital</w:t>
-            </w:r>
-          </w:p>
-        </w:tc>
-        <w:tc>
-          <w:tcPr>
-            <w:tcW w:w="3467" w:type="dxa"/>
-            <w:tcBorders/>
-          </w:tcPr>
-          <w:p>
-            <w:pPr>
-              <w:pStyle w:val="Normal"/>
-              <w:widowControl/>
-              <w:spacing w:lineRule="auto" w:line="240" w:before="0" w:after="20"/>
-              <w:jc w:val="left"/>
-              <w:rPr>
-                <w:rFonts w:ascii="Cambria" w:hAnsi="Cambria" w:eastAsia="ＭＳ 明朝" w:cs=""/>
-                <w:kern w:val="0"/>
-                <w:szCs w:val="22"/>
-                <w:lang w:val="en-US" w:eastAsia="en-US" w:bidi="ar-SA"/>
-              </w:rPr>
-            </w:pPr>
-            <w:r>
-              <w:rPr>
-                <w:rFonts w:eastAsia="ＭＳ 明朝" w:cs=""/>
-                <w:kern w:val="0"/>
-                <w:sz w:val="18"/>
-                <w:szCs w:val="22"/>
-                <w:lang w:val="en-US" w:eastAsia="en-US" w:bidi="ar-SA"/>
-              </w:rPr>
-              <w:t>Endurecimiento del canal, propagación favorable, precodificadores MRT y ZF, contaminación de pilotos, arrays 64–512 antenas, beamforming híbrido</w:t>
-            </w:r>
-          </w:p>
-        </w:tc>
-        <w:tc>
-          <w:tcPr>
-            <w:tcW w:w="3300" w:type="dxa"/>
-            <w:tcBorders/>
-          </w:tcPr>
-          <w:p>
-            <w:pPr>
-              <w:pStyle w:val="Normal"/>
-              <w:widowControl/>
-              <w:spacing w:lineRule="auto" w:line="240" w:before="0" w:after="20"/>
-              <w:jc w:val="left"/>
-              <w:rPr>
-                <w:rFonts w:ascii="Cambria" w:hAnsi="Cambria" w:eastAsia="ＭＳ 明朝" w:cs=""/>
-                <w:kern w:val="0"/>
-                <w:szCs w:val="22"/>
-                <w:lang w:val="en-US" w:eastAsia="en-US" w:bidi="ar-SA"/>
-              </w:rPr>
-            </w:pPr>
-            <w:r>
-              <w:rPr>
-                <w:rFonts w:eastAsia="ＭＳ 明朝" w:cs=""/>
-                <w:kern w:val="0"/>
-                <w:sz w:val="18"/>
-                <w:szCs w:val="22"/>
-                <w:lang w:val="en-US" w:eastAsia="en-US" w:bidi="ar-SA"/>
-              </w:rPr>
-              <w:t>Precodificadores MRT/ZF para M=8,32,128 antenas y K=4 usuarios; tasa suma vs #antenas</w:t>
-            </w:r>
-          </w:p>
-        </w:tc>
-      </w:tr>
-      <w:tr>
-        <w:trPr/>
-        <w:tc>
-          <w:tcPr>
-            <w:tcW w:w="617" w:type="dxa"/>
-            <w:tcBorders/>
-          </w:tcPr>
-          <w:p>
-            <w:pPr>
-              <w:pStyle w:val="Normal"/>
-              <w:widowControl/>
-              <w:spacing w:lineRule="auto" w:line="240" w:before="0" w:after="20"/>
-              <w:jc w:val="left"/>
-              <w:rPr>
-                <w:rFonts w:ascii="Cambria" w:hAnsi="Cambria" w:eastAsia="ＭＳ 明朝" w:cs=""/>
-                <w:kern w:val="0"/>
-                <w:szCs w:val="22"/>
-                <w:lang w:val="en-US" w:eastAsia="en-US" w:bidi="ar-SA"/>
-              </w:rPr>
-            </w:pPr>
-            <w:r>
-              <w:rPr>
-                <w:rFonts w:eastAsia="ＭＳ 明朝" w:cs=""/>
+                <w:b/>
                 <w:kern w:val="0"/>
                 <w:sz w:val="18"/>
                 <w:szCs w:val="22"/>
@@ -1854,7 +1883,7 @@
             <w:pPr>
               <w:pStyle w:val="Normal"/>
               <w:widowControl/>
-              <w:spacing w:lineRule="auto" w:line="240" w:before="0" w:after="20"/>
+              <w:spacing w:lineRule="auto" w:line="240" w:before="0" w:after="0"/>
               <w:jc w:val="left"/>
               <w:rPr>
                 <w:rFonts w:ascii="Cambria" w:hAnsi="Cambria" w:eastAsia="ＭＳ 明朝" w:cs=""/>
@@ -1866,12 +1895,13 @@
             <w:r>
               <w:rPr>
                 <w:rFonts w:eastAsia="ＭＳ 明朝" w:cs=""/>
+                <w:b/>
                 <w:kern w:val="0"/>
                 <w:sz w:val="18"/>
                 <w:szCs w:val="22"/>
                 <w:lang w:val="en-US" w:eastAsia="en-US" w:bidi="ar-SA"/>
               </w:rPr>
-              <w:t>Estimación de Canal: Métodos Clásicos</w:t>
+              <w:t>Examen Parcial</w:t>
             </w:r>
           </w:p>
         </w:tc>
@@ -1884,7 +1914,7 @@
             <w:pPr>
               <w:pStyle w:val="Normal"/>
               <w:widowControl/>
-              <w:spacing w:lineRule="auto" w:line="240" w:before="0" w:after="20"/>
+              <w:spacing w:lineRule="auto" w:line="240" w:before="0" w:after="0"/>
               <w:jc w:val="left"/>
               <w:rPr>
                 <w:rFonts w:ascii="Cambria" w:hAnsi="Cambria" w:eastAsia="ＭＳ 明朝" w:cs=""/>
@@ -1896,12 +1926,13 @@
             <w:r>
               <w:rPr>
                 <w:rFonts w:eastAsia="ＭＳ 明朝" w:cs=""/>
+                <w:b/>
                 <w:kern w:val="0"/>
                 <w:sz w:val="18"/>
                 <w:szCs w:val="22"/>
                 <w:lang w:val="en-US" w:eastAsia="en-US" w:bidi="ar-SA"/>
               </w:rPr>
-              <w:t>Estimación basada en pilotos, estimador LS, estimador MMSE, filtro de Wiener, cuadrícula de pilotos OFDM, SRS/DMRS en 5G NR</w:t>
+              <w:t>—</w:t>
             </w:r>
           </w:p>
         </w:tc>
@@ -1914,7 +1945,7 @@
             <w:pPr>
               <w:pStyle w:val="Normal"/>
               <w:widowControl/>
-              <w:spacing w:lineRule="auto" w:line="240" w:before="0" w:after="20"/>
+              <w:spacing w:lineRule="auto" w:line="240" w:before="0" w:after="0"/>
               <w:jc w:val="left"/>
               <w:rPr>
                 <w:rFonts w:ascii="Cambria" w:hAnsi="Cambria" w:eastAsia="ＭＳ 明朝" w:cs=""/>
@@ -1926,12 +1957,13 @@
             <w:r>
               <w:rPr>
                 <w:rFonts w:eastAsia="ＭＳ 明朝" w:cs=""/>
+                <w:b/>
                 <w:kern w:val="0"/>
                 <w:sz w:val="18"/>
                 <w:szCs w:val="22"/>
                 <w:lang w:val="en-US" w:eastAsia="en-US" w:bidi="ar-SA"/>
               </w:rPr>
-              <w:t>Estimadores LS y MMSE sobre cuadrícula OFDM; MSE vs SNR; efecto de la densidad de pilotos</w:t>
+              <w:t>—</w:t>
             </w:r>
           </w:p>
         </w:tc>
@@ -1947,7 +1979,7 @@
             <w:pPr>
               <w:pStyle w:val="Normal"/>
               <w:widowControl/>
-              <w:spacing w:lineRule="auto" w:line="240" w:before="0" w:after="20"/>
+              <w:spacing w:lineRule="auto" w:line="240" w:before="0" w:after="0"/>
               <w:jc w:val="left"/>
               <w:rPr>
                 <w:rFonts w:ascii="Cambria" w:hAnsi="Cambria" w:eastAsia="ＭＳ 明朝" w:cs=""/>
@@ -1959,6 +1991,7 @@
             <w:r>
               <w:rPr>
                 <w:rFonts w:eastAsia="ＭＳ 明朝" w:cs=""/>
+                <w:b/>
                 <w:kern w:val="0"/>
                 <w:sz w:val="18"/>
                 <w:szCs w:val="22"/>
@@ -1977,7 +2010,7 @@
             <w:pPr>
               <w:pStyle w:val="Normal"/>
               <w:widowControl/>
-              <w:spacing w:lineRule="auto" w:line="240" w:before="0" w:after="20"/>
+              <w:spacing w:lineRule="auto" w:line="240" w:before="0" w:after="0"/>
               <w:jc w:val="left"/>
               <w:rPr>
                 <w:rFonts w:ascii="Cambria" w:hAnsi="Cambria" w:eastAsia="ＭＳ 明朝" w:cs=""/>
@@ -1989,6 +2022,134 @@
             <w:r>
               <w:rPr>
                 <w:rFonts w:eastAsia="ＭＳ 明朝" w:cs=""/>
+                <w:b/>
+                <w:kern w:val="0"/>
+                <w:sz w:val="18"/>
+                <w:szCs w:val="22"/>
+                <w:lang w:val="en-US" w:eastAsia="en-US" w:bidi="ar-SA"/>
+              </w:rPr>
+              <w:t>Fundamentos MIMO y MIMO Masivo</w:t>
+            </w:r>
+          </w:p>
+        </w:tc>
+        <w:tc>
+          <w:tcPr>
+            <w:tcW w:w="3467" w:type="dxa"/>
+            <w:tcBorders/>
+          </w:tcPr>
+          <w:p>
+            <w:pPr>
+              <w:pStyle w:val="Normal"/>
+              <w:widowControl/>
+              <w:spacing w:lineRule="auto" w:line="240" w:before="0" w:after="0"/>
+              <w:jc w:val="left"/>
+              <w:rPr>
+                <w:rFonts w:ascii="Cambria" w:hAnsi="Cambria" w:eastAsia="ＭＳ 明朝" w:cs=""/>
+                <w:kern w:val="0"/>
+                <w:szCs w:val="22"/>
+                <w:lang w:val="en-US" w:eastAsia="en-US" w:bidi="ar-SA"/>
+              </w:rPr>
+            </w:pPr>
+            <w:r>
+              <w:rPr>
+                <w:rFonts w:eastAsia="ＭＳ 明朝" w:cs=""/>
+                <w:b/>
+                <w:kern w:val="0"/>
+                <w:sz w:val="18"/>
+                <w:szCs w:val="22"/>
+                <w:lang w:val="en-US" w:eastAsia="en-US" w:bidi="ar-SA"/>
+              </w:rPr>
+              <w:t>SISO→MIMO, matriz de canal, SVD, water-filling, capacidad, compromiso diversidad-multiplexación, MRT y ZF, endurecimiento del canal, propagación favorable, contaminación de pilotos, arrays 64–512 antenas</w:t>
+            </w:r>
+          </w:p>
+        </w:tc>
+        <w:tc>
+          <w:tcPr>
+            <w:tcW w:w="3300" w:type="dxa"/>
+            <w:tcBorders/>
+          </w:tcPr>
+          <w:p>
+            <w:pPr>
+              <w:pStyle w:val="Normal"/>
+              <w:widowControl/>
+              <w:spacing w:lineRule="auto" w:line="240" w:before="0" w:after="0"/>
+              <w:jc w:val="left"/>
+              <w:rPr>
+                <w:rFonts w:ascii="Cambria" w:hAnsi="Cambria" w:eastAsia="ＭＳ 明朝" w:cs=""/>
+                <w:kern w:val="0"/>
+                <w:szCs w:val="22"/>
+                <w:lang w:val="en-US" w:eastAsia="en-US" w:bidi="ar-SA"/>
+              </w:rPr>
+            </w:pPr>
+            <w:r>
+              <w:rPr>
+                <w:rFonts w:eastAsia="ＭＳ 明朝" w:cs=""/>
+                <w:b/>
+                <w:kern w:val="0"/>
+                <w:sz w:val="18"/>
+                <w:szCs w:val="22"/>
+                <w:lang w:val="en-US" w:eastAsia="en-US" w:bidi="ar-SA"/>
+              </w:rPr>
+              <w:t>Capacidad MIMO vía SVD; precodificadores MRT/ZF para M=8,32,128 antenas y K=4 usuarios</w:t>
+            </w:r>
+          </w:p>
+        </w:tc>
+      </w:tr>
+      <w:tr>
+        <w:trPr/>
+        <w:tc>
+          <w:tcPr>
+            <w:tcW w:w="617" w:type="dxa"/>
+            <w:tcBorders/>
+          </w:tcPr>
+          <w:p>
+            <w:pPr>
+              <w:pStyle w:val="Normal"/>
+              <w:widowControl/>
+              <w:spacing w:lineRule="auto" w:line="240" w:before="0" w:after="0"/>
+              <w:jc w:val="left"/>
+              <w:rPr>
+                <w:rFonts w:ascii="Cambria" w:hAnsi="Cambria" w:eastAsia="ＭＳ 明朝" w:cs=""/>
+                <w:kern w:val="0"/>
+                <w:szCs w:val="22"/>
+                <w:lang w:val="en-US" w:eastAsia="en-US" w:bidi="ar-SA"/>
+              </w:rPr>
+            </w:pPr>
+            <w:r>
+              <w:rPr>
+                <w:rFonts w:eastAsia="ＭＳ 明朝" w:cs=""/>
+                <w:b/>
+                <w:kern w:val="0"/>
+                <w:sz w:val="18"/>
+                <w:szCs w:val="22"/>
+                <w:lang w:val="en-US" w:eastAsia="en-US" w:bidi="ar-SA"/>
+              </w:rPr>
+              <w:t>10</w:t>
+            </w:r>
+          </w:p>
+        </w:tc>
+        <w:tc>
+          <w:tcPr>
+            <w:tcW w:w="1983" w:type="dxa"/>
+            <w:tcBorders/>
+          </w:tcPr>
+          <w:p>
+            <w:pPr>
+              <w:pStyle w:val="Normal"/>
+              <w:widowControl/>
+              <w:spacing w:lineRule="auto" w:line="240" w:before="0" w:after="0"/>
+              <w:jc w:val="left"/>
+              <w:rPr>
+                <w:rFonts w:ascii="Cambria" w:hAnsi="Cambria" w:eastAsia="ＭＳ 明朝" w:cs=""/>
+                <w:kern w:val="0"/>
+                <w:szCs w:val="22"/>
+                <w:lang w:val="en-US" w:eastAsia="en-US" w:bidi="ar-SA"/>
+              </w:rPr>
+            </w:pPr>
+            <w:r>
+              <w:rPr>
+                <w:rFonts w:eastAsia="ＭＳ 明朝" w:cs=""/>
+                <w:b/>
                 <w:kern w:val="0"/>
                 <w:sz w:val="18"/>
                 <w:szCs w:val="22"/>
@@ -2007,7 +2168,7 @@
             <w:pPr>
               <w:pStyle w:val="Normal"/>
               <w:widowControl/>
-              <w:spacing w:lineRule="auto" w:line="240" w:before="0" w:after="20"/>
+              <w:spacing w:lineRule="auto" w:line="240" w:before="0" w:after="0"/>
               <w:jc w:val="left"/>
               <w:rPr>
                 <w:rFonts w:ascii="Cambria" w:hAnsi="Cambria" w:eastAsia="ＭＳ 明朝" w:cs=""/>
@@ -2019,6 +2180,7 @@
             <w:r>
               <w:rPr>
                 <w:rFonts w:eastAsia="ＭＳ 明朝" w:cs=""/>
+                <w:b/>
                 <w:kern w:val="0"/>
                 <w:sz w:val="18"/>
                 <w:szCs w:val="22"/>
@@ -2037,7 +2199,7 @@
             <w:pPr>
               <w:pStyle w:val="Normal"/>
               <w:widowControl/>
-              <w:spacing w:lineRule="auto" w:line="240" w:before="0" w:after="20"/>
+              <w:spacing w:lineRule="auto" w:line="240" w:before="0" w:after="0"/>
               <w:jc w:val="left"/>
               <w:rPr>
                 <w:rFonts w:ascii="Cambria" w:hAnsi="Cambria" w:eastAsia="ＭＳ 明朝" w:cs=""/>
@@ -2049,6 +2211,7 @@
             <w:r>
               <w:rPr>
                 <w:rFonts w:eastAsia="ＭＳ 明朝" w:cs=""/>
+                <w:b/>
                 <w:kern w:val="0"/>
                 <w:sz w:val="18"/>
                 <w:szCs w:val="22"/>
@@ -2070,7 +2233,7 @@
             <w:pPr>
               <w:pStyle w:val="Normal"/>
               <w:widowControl/>
-              <w:spacing w:lineRule="auto" w:line="240" w:before="0" w:after="20"/>
+              <w:spacing w:lineRule="auto" w:line="240" w:before="0" w:after="0"/>
               <w:jc w:val="left"/>
               <w:rPr>
                 <w:rFonts w:ascii="Cambria" w:hAnsi="Cambria" w:eastAsia="ＭＳ 明朝" w:cs=""/>
@@ -2082,12 +2245,13 @@
             <w:r>
               <w:rPr>
                 <w:rFonts w:eastAsia="ＭＳ 明朝" w:cs=""/>
+                <w:b/>
                 <w:kern w:val="0"/>
                 <w:sz w:val="18"/>
                 <w:szCs w:val="22"/>
                 <w:lang w:val="en-US" w:eastAsia="en-US" w:bidi="ar-SA"/>
               </w:rPr>
-              <w:t>10</w:t>
+              <w:t>11</w:t>
             </w:r>
           </w:p>
         </w:tc>
@@ -2100,7 +2264,7 @@
             <w:pPr>
               <w:pStyle w:val="Normal"/>
               <w:widowControl/>
-              <w:spacing w:lineRule="auto" w:line="240" w:before="0" w:after="20"/>
+              <w:spacing w:lineRule="auto" w:line="240" w:before="0" w:after="0"/>
               <w:jc w:val="left"/>
               <w:rPr>
                 <w:rFonts w:ascii="Cambria" w:hAnsi="Cambria" w:eastAsia="ＭＳ 明朝" w:cs=""/>
@@ -2112,12 +2276,13 @@
             <w:r>
               <w:rPr>
                 <w:rFonts w:eastAsia="ＭＳ 明朝" w:cs=""/>
+                <w:b/>
                 <w:kern w:val="0"/>
                 <w:sz w:val="18"/>
                 <w:szCs w:val="22"/>
                 <w:lang w:val="en-US" w:eastAsia="en-US" w:bidi="ar-SA"/>
               </w:rPr>
-              <w:t>Comunicaciones mmWave y Sub-THz</w:t>
+              <w:t>Comunicaciones mmWave</w:t>
             </w:r>
           </w:p>
         </w:tc>
@@ -2130,7 +2295,7 @@
             <w:pPr>
               <w:pStyle w:val="Normal"/>
               <w:widowControl/>
-              <w:spacing w:lineRule="auto" w:line="240" w:before="0" w:after="20"/>
+              <w:spacing w:lineRule="auto" w:line="240" w:before="0" w:after="0"/>
               <w:jc w:val="left"/>
               <w:rPr>
                 <w:rFonts w:ascii="Cambria" w:hAnsi="Cambria" w:eastAsia="ＭＳ 明朝" w:cs=""/>
@@ -2142,12 +2307,13 @@
             <w:r>
               <w:rPr>
                 <w:rFonts w:eastAsia="ＭＳ 明朝" w:cs=""/>
+                <w:b/>
                 <w:kern w:val="0"/>
                 <w:sz w:val="18"/>
                 <w:szCs w:val="22"/>
                 <w:lang w:val="en-US" w:eastAsia="en-US" w:bidi="ar-SA"/>
               </w:rPr>
-              <w:t>Espectro 24–100 GHz, propagación mmWave, arrays de antenas, beamforming híbrido, gestión de haz en 5G NR FR2, sub-THz para 6G, modelos de canal THz</w:t>
+              <w:t>Espectro 24–100 GHz, propagación mmWave, arrays de antenas, beamforming híbrido, gestión de haz en 5G NR FR2</w:t>
             </w:r>
           </w:p>
         </w:tc>
@@ -2160,7 +2326,7 @@
             <w:pPr>
               <w:pStyle w:val="Normal"/>
               <w:widowControl/>
-              <w:spacing w:lineRule="auto" w:line="240" w:before="0" w:after="20"/>
+              <w:spacing w:lineRule="auto" w:line="240" w:before="0" w:after="0"/>
               <w:jc w:val="left"/>
               <w:rPr>
                 <w:rFonts w:ascii="Cambria" w:hAnsi="Cambria" w:eastAsia="ＭＳ 明朝" w:cs=""/>
@@ -2172,6 +2338,7 @@
             <w:r>
               <w:rPr>
                 <w:rFonts w:eastAsia="ＭＳ 明朝" w:cs=""/>
+                <w:b/>
                 <w:kern w:val="0"/>
                 <w:sz w:val="18"/>
                 <w:szCs w:val="22"/>
@@ -2193,7 +2360,7 @@
             <w:pPr>
               <w:pStyle w:val="Normal"/>
               <w:widowControl/>
-              <w:spacing w:lineRule="auto" w:line="240" w:before="0" w:after="20"/>
+              <w:spacing w:lineRule="auto" w:line="240" w:before="0" w:after="0"/>
               <w:jc w:val="left"/>
               <w:rPr>
                 <w:rFonts w:ascii="Cambria" w:hAnsi="Cambria" w:eastAsia="ＭＳ 明朝" w:cs=""/>
@@ -2205,129 +2372,7 @@
             <w:r>
               <w:rPr>
                 <w:rFonts w:eastAsia="ＭＳ 明朝" w:cs=""/>
-                <w:kern w:val="0"/>
-                <w:sz w:val="18"/>
-                <w:szCs w:val="22"/>
-                <w:lang w:val="en-US" w:eastAsia="en-US" w:bidi="ar-SA"/>
-              </w:rPr>
-              <w:t>11</w:t>
-            </w:r>
-          </w:p>
-        </w:tc>
-        <w:tc>
-          <w:tcPr>
-            <w:tcW w:w="1983" w:type="dxa"/>
-            <w:tcBorders/>
-          </w:tcPr>
-          <w:p>
-            <w:pPr>
-              <w:pStyle w:val="Normal"/>
-              <w:widowControl/>
-              <w:spacing w:lineRule="auto" w:line="240" w:before="0" w:after="20"/>
-              <w:jc w:val="left"/>
-              <w:rPr>
-                <w:rFonts w:ascii="Cambria" w:hAnsi="Cambria" w:eastAsia="ＭＳ 明朝" w:cs=""/>
-                <w:kern w:val="0"/>
-                <w:szCs w:val="22"/>
-                <w:lang w:val="en-US" w:eastAsia="en-US" w:bidi="ar-SA"/>
-              </w:rPr>
-            </w:pPr>
-            <w:r>
-              <w:rPr>
-                <w:rFonts w:eastAsia="ＭＳ 明朝" w:cs=""/>
-                <w:kern w:val="0"/>
-                <w:sz w:val="18"/>
-                <w:szCs w:val="22"/>
-                <w:lang w:val="en-US" w:eastAsia="en-US" w:bidi="ar-SA"/>
-              </w:rPr>
-              <w:t>Superficies Inteligentes Reconfigurables (RIS)</w:t>
-            </w:r>
-          </w:p>
-        </w:tc>
-        <w:tc>
-          <w:tcPr>
-            <w:tcW w:w="3467" w:type="dxa"/>
-            <w:tcBorders/>
-          </w:tcPr>
-          <w:p>
-            <w:pPr>
-              <w:pStyle w:val="Normal"/>
-              <w:widowControl/>
-              <w:spacing w:lineRule="auto" w:line="240" w:before="0" w:after="20"/>
-              <w:jc w:val="left"/>
-              <w:rPr>
-                <w:rFonts w:ascii="Cambria" w:hAnsi="Cambria" w:eastAsia="ＭＳ 明朝" w:cs=""/>
-                <w:kern w:val="0"/>
-                <w:szCs w:val="22"/>
-                <w:lang w:val="en-US" w:eastAsia="en-US" w:bidi="ar-SA"/>
-              </w:rPr>
-            </w:pPr>
-            <w:r>
-              <w:rPr>
-                <w:rFonts w:eastAsia="ＭＳ 明朝" w:cs=""/>
-                <w:kern w:val="0"/>
-                <w:sz w:val="18"/>
-                <w:szCs w:val="22"/>
-                <w:lang w:val="en-US" w:eastAsia="en-US" w:bidi="ar-SA"/>
-              </w:rPr>
-              <w:t>RIS pasiva vs activa, campo cercano/lejano, canal en cascada, matriz de desfase, optimización de fases, RIS vs relé, estandarización 6G</w:t>
-            </w:r>
-          </w:p>
-        </w:tc>
-        <w:tc>
-          <w:tcPr>
-            <w:tcW w:w="3300" w:type="dxa"/>
-            <w:tcBorders/>
-          </w:tcPr>
-          <w:p>
-            <w:pPr>
-              <w:pStyle w:val="Normal"/>
-              <w:widowControl/>
-              <w:spacing w:lineRule="auto" w:line="240" w:before="0" w:after="20"/>
-              <w:jc w:val="left"/>
-              <w:rPr>
-                <w:rFonts w:ascii="Cambria" w:hAnsi="Cambria" w:eastAsia="ＭＳ 明朝" w:cs=""/>
-                <w:kern w:val="0"/>
-                <w:szCs w:val="22"/>
-                <w:lang w:val="en-US" w:eastAsia="en-US" w:bidi="ar-SA"/>
-              </w:rPr>
-            </w:pPr>
-            <w:r>
-              <w:rPr>
-                <w:rFonts w:eastAsia="ＭＳ 明朝" w:cs=""/>
-                <w:kern w:val="0"/>
-                <w:sz w:val="18"/>
-                <w:szCs w:val="22"/>
-                <w:lang w:val="en-US" w:eastAsia="en-US" w:bidi="ar-SA"/>
-              </w:rPr>
-              <w:t>Optimización de fases; SNR vs #elementos RIS; mapas de cobertura con/sin RIS</w:t>
-            </w:r>
-          </w:p>
-        </w:tc>
-      </w:tr>
-      <w:tr>
-        <w:trPr/>
-        <w:tc>
-          <w:tcPr>
-            <w:tcW w:w="617" w:type="dxa"/>
-            <w:tcBorders/>
-          </w:tcPr>
-          <w:p>
-            <w:pPr>
-              <w:pStyle w:val="Normal"/>
-              <w:widowControl/>
-              <w:spacing w:lineRule="auto" w:line="240" w:before="0" w:after="20"/>
-              <w:jc w:val="left"/>
-              <w:rPr>
-                <w:rFonts w:ascii="Cambria" w:hAnsi="Cambria" w:eastAsia="ＭＳ 明朝" w:cs=""/>
-                <w:kern w:val="0"/>
-                <w:szCs w:val="22"/>
-                <w:lang w:val="en-US" w:eastAsia="en-US" w:bidi="ar-SA"/>
-              </w:rPr>
-            </w:pPr>
-            <w:r>
-              <w:rPr>
-                <w:rFonts w:eastAsia="ＭＳ 明朝" w:cs=""/>
+                <w:b/>
                 <w:kern w:val="0"/>
                 <w:sz w:val="18"/>
                 <w:szCs w:val="22"/>
@@ -2346,7 +2391,7 @@
             <w:pPr>
               <w:pStyle w:val="Normal"/>
               <w:widowControl/>
-              <w:spacing w:lineRule="auto" w:line="240" w:before="0" w:after="20"/>
+              <w:spacing w:lineRule="auto" w:line="240" w:before="0" w:after="0"/>
               <w:jc w:val="left"/>
               <w:rPr>
                 <w:rFonts w:ascii="Cambria" w:hAnsi="Cambria" w:eastAsia="ＭＳ 明朝" w:cs=""/>
@@ -2358,12 +2403,13 @@
             <w:r>
               <w:rPr>
                 <w:rFonts w:eastAsia="ＭＳ 明朝" w:cs=""/>
+                <w:b/>
                 <w:kern w:val="0"/>
                 <w:sz w:val="18"/>
                 <w:szCs w:val="22"/>
                 <w:lang w:val="en-US" w:eastAsia="en-US" w:bidi="ar-SA"/>
               </w:rPr>
-              <w:t>Detección e Integración con Comunicaciones (ISAC)</w:t>
+              <w:t>Seminario — IA en Comunicaciones Inalámbricas</w:t>
             </w:r>
           </w:p>
         </w:tc>
@@ -2376,7 +2422,7 @@
             <w:pPr>
               <w:pStyle w:val="Normal"/>
               <w:widowControl/>
-              <w:spacing w:lineRule="auto" w:line="240" w:before="0" w:after="20"/>
+              <w:spacing w:lineRule="auto" w:line="240" w:before="0" w:after="0"/>
               <w:jc w:val="left"/>
               <w:rPr>
                 <w:rFonts w:ascii="Cambria" w:hAnsi="Cambria" w:eastAsia="ＭＳ 明朝" w:cs=""/>
@@ -2388,12 +2434,13 @@
             <w:r>
               <w:rPr>
                 <w:rFonts w:eastAsia="ＭＳ 明朝" w:cs=""/>
+                <w:b/>
                 <w:kern w:val="0"/>
                 <w:sz w:val="18"/>
                 <w:szCs w:val="22"/>
                 <w:lang w:val="en-US" w:eastAsia="en-US" w:bidi="ar-SA"/>
               </w:rPr>
-              <w:t>Forma de onda dual, radar OFDM, estimación rango-Doppler, resolución en rango, compromiso detección-comunicación, aplicaciones V2X</w:t>
+              <w:t>Lectura y discusión de papers: taxonomía ML para comunicaciones, CNN para clasificación de modulación (AMC), autoencoder TX+RX, DNN para estimación de canal</w:t>
             </w:r>
           </w:p>
         </w:tc>
@@ -2406,7 +2453,7 @@
             <w:pPr>
               <w:pStyle w:val="Normal"/>
               <w:widowControl/>
-              <w:spacing w:lineRule="auto" w:line="240" w:before="0" w:after="20"/>
+              <w:spacing w:lineRule="auto" w:line="240" w:before="0" w:after="0"/>
               <w:jc w:val="left"/>
               <w:rPr>
                 <w:rFonts w:ascii="Cambria" w:hAnsi="Cambria" w:eastAsia="ＭＳ 明朝" w:cs=""/>
@@ -2418,12 +2465,13 @@
             <w:r>
               <w:rPr>
                 <w:rFonts w:eastAsia="ＭＳ 明朝" w:cs=""/>
+                <w:b/>
                 <w:kern w:val="0"/>
                 <w:sz w:val="18"/>
                 <w:szCs w:val="22"/>
                 <w:lang w:val="en-US" w:eastAsia="en-US" w:bidi="ar-SA"/>
               </w:rPr>
-              <w:t>Forma de onda OFDM compartida; mapa rango-Doppler 2D FFT; SINR comms vs SNR radar</w:t>
+              <w:t>—</w:t>
             </w:r>
           </w:p>
         </w:tc>
@@ -2439,7 +2487,7 @@
             <w:pPr>
               <w:pStyle w:val="Normal"/>
               <w:widowControl/>
-              <w:spacing w:lineRule="auto" w:line="240" w:before="0" w:after="20"/>
+              <w:spacing w:lineRule="auto" w:line="240" w:before="0" w:after="0"/>
               <w:jc w:val="left"/>
               <w:rPr>
                 <w:rFonts w:ascii="Cambria" w:hAnsi="Cambria" w:eastAsia="ＭＳ 明朝" w:cs=""/>
@@ -2451,6 +2499,7 @@
             <w:r>
               <w:rPr>
                 <w:rFonts w:eastAsia="ＭＳ 明朝" w:cs=""/>
+                <w:b/>
                 <w:kern w:val="0"/>
                 <w:sz w:val="18"/>
                 <w:szCs w:val="22"/>
@@ -2469,7 +2518,7 @@
             <w:pPr>
               <w:pStyle w:val="Normal"/>
               <w:widowControl/>
-              <w:spacing w:lineRule="auto" w:line="240" w:before="0" w:after="20"/>
+              <w:spacing w:lineRule="auto" w:line="240" w:before="0" w:after="0"/>
               <w:jc w:val="left"/>
               <w:rPr>
                 <w:rFonts w:ascii="Cambria" w:hAnsi="Cambria" w:eastAsia="ＭＳ 明朝" w:cs=""/>
@@ -2481,12 +2530,13 @@
             <w:r>
               <w:rPr>
                 <w:rFonts w:eastAsia="ＭＳ 明朝" w:cs=""/>
+                <w:b/>
                 <w:kern w:val="0"/>
                 <w:sz w:val="18"/>
                 <w:szCs w:val="22"/>
                 <w:lang w:val="en-US" w:eastAsia="en-US" w:bidi="ar-SA"/>
               </w:rPr>
-              <w:t>Radio Cognitiva y Gestión Dinámica de Espectro</w:t>
+              <w:t>Seminario — Software-Defined Radio</w:t>
             </w:r>
           </w:p>
         </w:tc>
@@ -2499,7 +2549,7 @@
             <w:pPr>
               <w:pStyle w:val="Normal"/>
               <w:widowControl/>
-              <w:spacing w:lineRule="auto" w:line="240" w:before="0" w:after="20"/>
+              <w:spacing w:lineRule="auto" w:line="240" w:before="0" w:after="0"/>
               <w:jc w:val="left"/>
               <w:rPr>
                 <w:rFonts w:ascii="Cambria" w:hAnsi="Cambria" w:eastAsia="ＭＳ 明朝" w:cs=""/>
@@ -2511,12 +2561,13 @@
             <w:r>
               <w:rPr>
                 <w:rFonts w:eastAsia="ＭＳ 明朝" w:cs=""/>
+                <w:b/>
                 <w:kern w:val="0"/>
                 <w:sz w:val="18"/>
                 <w:szCs w:val="22"/>
                 <w:lang w:val="en-US" w:eastAsia="en-US" w:bidi="ar-SA"/>
               </w:rPr>
-              <w:t>Usuarios primarios/secundarios, detección de espectro (energía, filtro adaptado, ciclostacionaria), curva ROC, acceso dinámico al espectro, IoT/LPWAN: LoRa, NB-IoT, Sigfox</w:t>
+              <w:t>Lectura y discusión de papers: arquitecturas SDR, GNU Radio, plataformas USRP, diseño de formas de onda, aplicaciones en radio cognitiva</w:t>
             </w:r>
           </w:p>
         </w:tc>
@@ -2529,7 +2580,7 @@
             <w:pPr>
               <w:pStyle w:val="Normal"/>
               <w:widowControl/>
-              <w:spacing w:lineRule="auto" w:line="240" w:before="0" w:after="20"/>
+              <w:spacing w:lineRule="auto" w:line="240" w:before="0" w:after="0"/>
               <w:jc w:val="left"/>
               <w:rPr>
                 <w:rFonts w:ascii="Cambria" w:hAnsi="Cambria" w:eastAsia="ＭＳ 明朝" w:cs=""/>
@@ -2541,12 +2592,13 @@
             <w:r>
               <w:rPr>
                 <w:rFonts w:eastAsia="ＭＳ 明朝" w:cs=""/>
+                <w:b/>
                 <w:kern w:val="0"/>
                 <w:sz w:val="18"/>
                 <w:szCs w:val="22"/>
                 <w:lang w:val="en-US" w:eastAsia="en-US" w:bidi="ar-SA"/>
               </w:rPr>
-              <w:t>Detector de energía; curva ROC (Pd vs Pfa); presupuestos de enlace LoRa/NB-IoT/Sigfox</w:t>
+              <w:t>GNU Radio: modulación SDR en tiempo real</w:t>
             </w:r>
           </w:p>
         </w:tc>
@@ -2562,7 +2614,7 @@
             <w:pPr>
               <w:pStyle w:val="Normal"/>
               <w:widowControl/>
-              <w:spacing w:lineRule="auto" w:line="240" w:before="0" w:after="20"/>
+              <w:spacing w:lineRule="auto" w:line="240" w:before="0" w:after="0"/>
               <w:jc w:val="left"/>
               <w:rPr>
                 <w:rFonts w:ascii="Cambria" w:hAnsi="Cambria" w:eastAsia="ＭＳ 明朝" w:cs=""/>
@@ -2574,6 +2626,7 @@
             <w:r>
               <w:rPr>
                 <w:rFonts w:eastAsia="ＭＳ 明朝" w:cs=""/>
+                <w:b/>
                 <w:kern w:val="0"/>
                 <w:sz w:val="18"/>
                 <w:szCs w:val="22"/>
@@ -2592,7 +2645,7 @@
             <w:pPr>
               <w:pStyle w:val="Normal"/>
               <w:widowControl/>
-              <w:spacing w:lineRule="auto" w:line="240" w:before="0" w:after="20"/>
+              <w:spacing w:lineRule="auto" w:line="240" w:before="0" w:after="0"/>
               <w:jc w:val="left"/>
               <w:rPr>
                 <w:rFonts w:ascii="Cambria" w:hAnsi="Cambria" w:eastAsia="ＭＳ 明朝" w:cs=""/>
@@ -2604,12 +2657,13 @@
             <w:r>
               <w:rPr>
                 <w:rFonts w:eastAsia="ＭＳ 明朝" w:cs=""/>
+                <w:b/>
                 <w:kern w:val="0"/>
                 <w:sz w:val="18"/>
                 <w:szCs w:val="22"/>
                 <w:lang w:val="en-US" w:eastAsia="en-US" w:bidi="ar-SA"/>
               </w:rPr>
-              <w:t>IA/ML para Comunicaciones Inalámbricas</w:t>
+              <w:t>Seminario — Wireless IoT</w:t>
             </w:r>
           </w:p>
         </w:tc>
@@ -2622,7 +2676,7 @@
             <w:pPr>
               <w:pStyle w:val="Normal"/>
               <w:widowControl/>
-              <w:spacing w:lineRule="auto" w:line="240" w:before="0" w:after="20"/>
+              <w:spacing w:lineRule="auto" w:line="240" w:before="0" w:after="0"/>
               <w:jc w:val="left"/>
               <w:rPr>
                 <w:rFonts w:ascii="Cambria" w:hAnsi="Cambria" w:eastAsia="ＭＳ 明朝" w:cs=""/>
@@ -2634,12 +2688,13 @@
             <w:r>
               <w:rPr>
                 <w:rFonts w:eastAsia="ＭＳ 明朝" w:cs=""/>
+                <w:b/>
                 <w:kern w:val="0"/>
                 <w:sz w:val="18"/>
                 <w:szCs w:val="22"/>
                 <w:lang w:val="en-US" w:eastAsia="en-US" w:bidi="ar-SA"/>
               </w:rPr>
-              <w:t>Taxonomía ML para sistemas inalámbricos, CNN para clasificación de modulación (AMC), autoencoder TX+RX conjunto, DNN para estimación de canal, visión general de RL para asignación de recursos</w:t>
+              <w:t>Lectura y discusión de papers: LoRa, NB-IoT, Sigfox, presupuestos de enlace LPWAN, edge computing, protocolos de capa baja para IoT</w:t>
             </w:r>
           </w:p>
         </w:tc>
@@ -2652,7 +2707,7 @@
             <w:pPr>
               <w:pStyle w:val="Normal"/>
               <w:widowControl/>
-              <w:spacing w:lineRule="auto" w:line="240" w:before="0" w:after="20"/>
+              <w:spacing w:lineRule="auto" w:line="240" w:before="0" w:after="0"/>
               <w:jc w:val="left"/>
               <w:rPr>
                 <w:rFonts w:ascii="Cambria" w:hAnsi="Cambria" w:eastAsia="ＭＳ 明朝" w:cs=""/>
@@ -2664,12 +2719,13 @@
             <w:r>
               <w:rPr>
                 <w:rFonts w:eastAsia="ＭＳ 明朝" w:cs=""/>
+                <w:b/>
                 <w:kern w:val="0"/>
                 <w:sz w:val="18"/>
                 <w:szCs w:val="22"/>
                 <w:lang w:val="en-US" w:eastAsia="en-US" w:bidi="ar-SA"/>
               </w:rPr>
-              <w:t>Clasificador CNN AMC; autoencoder con constelación aprendida; estimador DNN vs LS/MMSE</w:t>
+              <w:t>—</w:t>
             </w:r>
           </w:p>
         </w:tc>
@@ -2685,7 +2741,7 @@
             <w:pPr>
               <w:pStyle w:val="Normal"/>
               <w:widowControl/>
-              <w:spacing w:lineRule="auto" w:line="240" w:before="0" w:after="20"/>
+              <w:spacing w:lineRule="auto" w:line="240" w:before="0" w:after="0"/>
               <w:jc w:val="left"/>
               <w:rPr>
                 <w:rFonts w:ascii="Cambria" w:hAnsi="Cambria" w:eastAsia="ＭＳ 明朝" w:cs=""/>
@@ -2697,6 +2753,7 @@
             <w:r>
               <w:rPr>
                 <w:rFonts w:eastAsia="ＭＳ 明朝" w:cs=""/>
+                <w:b/>
                 <w:kern w:val="0"/>
                 <w:sz w:val="18"/>
                 <w:szCs w:val="22"/>
@@ -2715,7 +2772,7 @@
             <w:pPr>
               <w:pStyle w:val="Normal"/>
               <w:widowControl/>
-              <w:spacing w:lineRule="auto" w:line="240" w:before="0" w:after="20"/>
+              <w:spacing w:lineRule="auto" w:line="240" w:before="0" w:after="0"/>
               <w:jc w:val="left"/>
               <w:rPr>
                 <w:rFonts w:ascii="Cambria" w:hAnsi="Cambria" w:eastAsia="ＭＳ 明朝" w:cs=""/>
@@ -2727,12 +2784,13 @@
             <w:r>
               <w:rPr>
                 <w:rFonts w:eastAsia="ＭＳ 明朝" w:cs=""/>
+                <w:b/>
                 <w:kern w:val="0"/>
                 <w:sz w:val="18"/>
                 <w:szCs w:val="22"/>
                 <w:lang w:val="en-US" w:eastAsia="en-US" w:bidi="ar-SA"/>
               </w:rPr>
-              <w:t>6G: Fronteras, Investigación Abierta y Redes Especializadas</w:t>
+              <w:t>6G: Fronteras e Investigación Abierta</w:t>
             </w:r>
           </w:p>
         </w:tc>
@@ -2745,7 +2803,7 @@
             <w:pPr>
               <w:pStyle w:val="Normal"/>
               <w:widowControl/>
-              <w:spacing w:lineRule="auto" w:line="240" w:before="0" w:after="20"/>
+              <w:spacing w:lineRule="auto" w:line="240" w:before="0" w:after="0"/>
               <w:jc w:val="left"/>
               <w:rPr>
                 <w:rFonts w:ascii="Cambria" w:hAnsi="Cambria" w:eastAsia="ＭＳ 明朝" w:cs=""/>
@@ -2757,12 +2815,13 @@
             <w:r>
               <w:rPr>
                 <w:rFonts w:eastAsia="ＭＳ 明朝" w:cs=""/>
+                <w:b/>
                 <w:kern w:val="0"/>
                 <w:sz w:val="18"/>
                 <w:szCs w:val="22"/>
                 <w:lang w:val="en-US" w:eastAsia="en-US" w:bidi="ar-SA"/>
               </w:rPr>
-              <w:t>Requisitos ITU-R IMT-2030, canal THz y absorción molecular, MIMO libre de celdas, redes no terrestres (NTN) LEO/MEO/GEO, aprendizaje federado, hoja de ruta 6G</w:t>
+              <w:t>Requisitos ITU-R IMT-2030, canal THz y absorción molecular, MIMO libre de celdas, redes no terrestres (NTN) LEO/MEO, aprendizaje federado, hoja de ruta 6G</w:t>
             </w:r>
           </w:p>
         </w:tc>
@@ -2775,7 +2834,7 @@
             <w:pPr>
               <w:pStyle w:val="Normal"/>
               <w:widowControl/>
-              <w:spacing w:lineRule="auto" w:line="240" w:before="0" w:after="20"/>
+              <w:spacing w:lineRule="auto" w:line="240" w:before="0" w:after="0"/>
               <w:jc w:val="left"/>
               <w:rPr>
                 <w:rFonts w:ascii="Cambria" w:hAnsi="Cambria" w:eastAsia="ＭＳ 明朝" w:cs=""/>
@@ -2787,12 +2846,140 @@
             <w:r>
               <w:rPr>
                 <w:rFonts w:eastAsia="ＭＳ 明朝" w:cs=""/>
+                <w:b/>
                 <w:kern w:val="0"/>
                 <w:sz w:val="18"/>
                 <w:szCs w:val="22"/>
                 <w:lang w:val="en-US" w:eastAsia="en-US" w:bidi="ar-SA"/>
               </w:rPr>
-              <w:t>Canal THz vs mmWave; presupuesto de enlace satélite LEO; FedAvg para estimación distribuida</w:t>
+              <w:t>—</w:t>
+            </w:r>
+          </w:p>
+        </w:tc>
+      </w:tr>
+      <w:tr>
+        <w:trPr/>
+        <w:tc>
+          <w:tcPr>
+            <w:tcW w:w="617" w:type="dxa"/>
+            <w:tcBorders/>
+          </w:tcPr>
+          <w:p>
+            <w:pPr>
+              <w:pStyle w:val="Normal"/>
+              <w:widowControl/>
+              <w:spacing w:lineRule="auto" w:line="240" w:before="0" w:after="0"/>
+              <w:jc w:val="left"/>
+              <w:rPr>
+                <w:rFonts w:ascii="Cambria" w:hAnsi="Cambria" w:eastAsia="ＭＳ 明朝" w:cs=""/>
+                <w:kern w:val="0"/>
+                <w:szCs w:val="22"/>
+                <w:lang w:val="en-US" w:eastAsia="en-US" w:bidi="ar-SA"/>
+              </w:rPr>
+            </w:pPr>
+            <w:r>
+              <w:rPr>
+                <w:rFonts w:eastAsia="ＭＳ 明朝" w:cs=""/>
+                <w:b/>
+                <w:kern w:val="0"/>
+                <w:sz w:val="18"/>
+                <w:szCs w:val="22"/>
+                <w:lang w:val="en-US" w:eastAsia="en-US" w:bidi="ar-SA"/>
+              </w:rPr>
+              <w:t>16</w:t>
+            </w:r>
+          </w:p>
+        </w:tc>
+        <w:tc>
+          <w:tcPr>
+            <w:tcW w:w="1983" w:type="dxa"/>
+            <w:tcBorders/>
+          </w:tcPr>
+          <w:p>
+            <w:pPr>
+              <w:pStyle w:val="Normal"/>
+              <w:widowControl/>
+              <w:spacing w:lineRule="auto" w:line="240" w:before="0" w:after="0"/>
+              <w:jc w:val="left"/>
+              <w:rPr>
+                <w:rFonts w:ascii="Cambria" w:hAnsi="Cambria" w:eastAsia="ＭＳ 明朝" w:cs=""/>
+                <w:kern w:val="0"/>
+                <w:szCs w:val="22"/>
+                <w:lang w:val="en-US" w:eastAsia="en-US" w:bidi="ar-SA"/>
+              </w:rPr>
+            </w:pPr>
+            <w:r>
+              <w:rPr>
+                <w:rFonts w:eastAsia="ＭＳ 明朝" w:cs=""/>
+                <w:b/>
+                <w:kern w:val="0"/>
+                <w:sz w:val="18"/>
+                <w:szCs w:val="22"/>
+                <w:lang w:val="en-US" w:eastAsia="en-US" w:bidi="ar-SA"/>
+              </w:rPr>
+              <w:t>Examen Final</w:t>
+            </w:r>
+          </w:p>
+        </w:tc>
+        <w:tc>
+          <w:tcPr>
+            <w:tcW w:w="3467" w:type="dxa"/>
+            <w:tcBorders/>
+          </w:tcPr>
+          <w:p>
+            <w:pPr>
+              <w:pStyle w:val="Normal"/>
+              <w:widowControl/>
+              <w:spacing w:lineRule="auto" w:line="240" w:before="0" w:after="0"/>
+              <w:jc w:val="left"/>
+              <w:rPr>
+                <w:rFonts w:ascii="Cambria" w:hAnsi="Cambria" w:eastAsia="ＭＳ 明朝" w:cs=""/>
+                <w:kern w:val="0"/>
+                <w:szCs w:val="22"/>
+                <w:lang w:val="en-US" w:eastAsia="en-US" w:bidi="ar-SA"/>
+              </w:rPr>
+            </w:pPr>
+            <w:r>
+              <w:rPr>
+                <w:rFonts w:eastAsia="ＭＳ 明朝" w:cs=""/>
+                <w:b/>
+                <w:kern w:val="0"/>
+                <w:sz w:val="18"/>
+                <w:szCs w:val="22"/>
+                <w:lang w:val="en-US" w:eastAsia="en-US" w:bidi="ar-SA"/>
+              </w:rPr>
+              <w:t>—</w:t>
+            </w:r>
+          </w:p>
+        </w:tc>
+        <w:tc>
+          <w:tcPr>
+            <w:tcW w:w="3300" w:type="dxa"/>
+            <w:tcBorders/>
+          </w:tcPr>
+          <w:p>
+            <w:pPr>
+              <w:pStyle w:val="Normal"/>
+              <w:widowControl/>
+              <w:spacing w:lineRule="auto" w:line="240" w:before="0" w:after="0"/>
+              <w:jc w:val="left"/>
+              <w:rPr>
+                <w:rFonts w:ascii="Cambria" w:hAnsi="Cambria" w:eastAsia="ＭＳ 明朝" w:cs=""/>
+                <w:kern w:val="0"/>
+                <w:szCs w:val="22"/>
+                <w:lang w:val="en-US" w:eastAsia="en-US" w:bidi="ar-SA"/>
+              </w:rPr>
+            </w:pPr>
+            <w:r>
+              <w:rPr>
+                <w:rFonts w:eastAsia="ＭＳ 明朝" w:cs=""/>
+                <w:b/>
+                <w:kern w:val="0"/>
+                <w:sz w:val="18"/>
+                <w:szCs w:val="22"/>
+                <w:lang w:val="en-US" w:eastAsia="en-US" w:bidi="ar-SA"/>
+              </w:rPr>
+              <w:t>—</w:t>
             </w:r>
           </w:p>
         </w:tc>

</xml_diff>

<commit_message>
feat(syllabus): añadir esquema de evaluación ponderada
- Examen Parcial (Clase 08): 30%
- Examen Final (Clase 16): 30%
- Promedio 4 labs (OFDM, GNU Radio, MIMO, SDR): 40%
- Actualizado en syllabus.md y syllabus-EEE10.docx

Co-Authored-By: Claude Sonnet 4.6 <noreply@anthropic.com>
</commit_message>
<xml_diff>
--- a/syllabus-EEE10.docx
+++ b/syllabus-EEE10.docx
@@ -3006,58 +3006,65 @@
       </w:r>
     </w:p>
     <w:p>
-      <w:pPr>
-        <w:pStyle w:val="Normal"/>
-        <w:spacing w:before="0" w:after="40"/>
-        <w:rPr/>
-      </w:pPr>
+      <w:pPr/>
       <w:r>
-        <w:rPr>
-          <w:sz w:val="20"/>
-        </w:rPr>
-        <w:t>Curso abierto y autónomo sin evaluación calificada. Cada sesión incluye:</w:t>
+        <w:t xml:space="preserve">Examen Parcial (Clase 08): 30%</w:t>
       </w:r>
     </w:p>
     <w:p>
-      <w:pPr>
-        <w:pStyle w:val="ListBullet"/>
-        <w:numPr>
-          <w:ilvl w:val="0"/>
-          <w:numId w:val="1"/>
-        </w:numPr>
-        <w:spacing w:before="0" w:after="20"/>
-        <w:contextualSpacing/>
-        <w:rPr/>
-      </w:pPr>
+      <w:pPr/>
       <w:r>
-        <w:rPr>
-          <w:sz w:val="20"/>
-        </w:rPr>
-        <w:t xml:space="preserve">≥ </w:t>
-      </w:r>
-      <w:r>
-        <w:rPr>
-          <w:sz w:val="20"/>
-        </w:rPr>
-        <w:t>5 ejercicios con soluciones de referencia paso a paso</w:t>
+        <w:t xml:space="preserve">Examen Final (Clase 16): 30%</w:t>
       </w:r>
     </w:p>
     <w:p>
+      <w:pPr/>
+      <w:r>
+        <w:t xml:space="preserve">Promedio de Laboratorios (4 labs): 40%</w:t>
+      </w:r>
+    </w:p>
+    <w:p>
+      <w:pPr/>
+      <w:r>
+        <w:t xml:space="preserve">La nota final es el promedio ponderado de los tres componentes, todos sobre 20 puntos.</w:t>
+      </w:r>
+    </w:p>
+    <w:p>
+      <w:pPr/>
+      <w:r>
+        <w:t xml:space="preserve">Los laboratorios previstos son:</w:t>
+      </w:r>
+    </w:p>
+    <w:p>
       <w:pPr>
         <w:pStyle w:val="ListBullet"/>
-        <w:numPr>
-          <w:ilvl w:val="0"/>
-          <w:numId w:val="1"/>
-        </w:numPr>
-        <w:spacing w:before="0" w:after="20"/>
-        <w:contextualSpacing/>
-        <w:rPr/>
       </w:pPr>
       <w:r>
-        <w:rPr>
-          <w:sz w:val="20"/>
-        </w:rPr>
-        <w:t>1 laboratorio Python (~90 min) ejecutable en Google Colab sin instalación local</w:t>
+        <w:t xml:space="preserve">Lab 1 — Sistemas OFDM (Clase 05)</w:t>
+      </w:r>
+    </w:p>
+    <w:p>
+      <w:pPr>
+        <w:pStyle w:val="ListBullet"/>
+      </w:pPr>
+      <w:r>
+        <w:t xml:space="preserve">Lab 2 — Lab OFDM con GNU Radio (Clase 06)</w:t>
+      </w:r>
+    </w:p>
+    <w:p>
+      <w:pPr>
+        <w:pStyle w:val="ListBullet"/>
+      </w:pPr>
+      <w:r>
+        <w:t xml:space="preserve">Lab 3 — Fundamentos MIMO y MIMO Masivo (Clase 09)</w:t>
+      </w:r>
+    </w:p>
+    <w:p>
+      <w:pPr>
+        <w:pStyle w:val="ListBullet"/>
+      </w:pPr>
+      <w:r>
+        <w:t xml:space="preserve">Lab 4 — Software-Defined Radio (Clase 13)</w:t>
       </w:r>
     </w:p>
     <w:p>

</xml_diff>